<commit_message>
feat: add L4 Parquet verification to the validate command
</commit_message>
<xml_diff>
--- a/docs/WeiSQL-项目状态报告.docx
+++ b/docs/WeiSQL-项目状态报告.docx
@@ -23,7 +23,7 @@
           <w:color w:val="595959"/>
           <w:sz w:val="20"/>
         </w:rPr>
-        <w:t>2026-10-31 · 仓库 HEAD 8e56946 · 217 个自动化测试 · 尚未发布 npm</w:t>
+        <w:t>2026-10-31 · 仓库 HEAD f554b01 · 220 个自动化测试 · 尚未发布 npm</w:t>
       </w:r>
     </w:p>
     <w:p>
@@ -40,7 +40,7 @@
           <w:rFonts w:ascii="微软雅黑" w:hAnsi="微软雅黑" w:eastAsia="微软雅黑" w:cs="微软雅黑"/>
           <w:sz w:val="21"/>
         </w:rPr>
-        <w:t>工程原型。Manifest V1 与数据包格式稳定，四个包共 217 个自动化测试，CI 覆盖构建、类型、测试与发布元数据；精确检索、ANN、全文、融合、RAG 与单文件容器均有实现与实测数字。尚未发布 npm 包，也没有任何未经测量的性能承诺。</w:t>
+        <w:t>工程原型。Manifest V1 与数据包格式稳定，四个包共 220 个自动化测试，CI 覆盖构建、类型、测试与发布元数据；精确检索、ANN、全文、融合、RAG 与单文件容器均有实现与实测数字。尚未发布 npm 包，也没有任何未经测量的性能承诺。</w:t>
       </w:r>
     </w:p>
     <w:tbl>
@@ -124,7 +124,7 @@
                 <w:rFonts w:ascii="微软雅黑" w:hAnsi="微软雅黑" w:eastAsia="微软雅黑" w:cs="微软雅黑"/>
                 <w:sz w:val="18"/>
               </w:rPr>
-              <w:t>217 个全绿（SDK 169 / DuckDB 19 / USearch 12 / CLI 17）</w:t>
+              <w:t>220 个全绿（SDK 169 / DuckDB 19 / USearch 12 / CLI 20）</w:t>
             </w:r>
           </w:p>
         </w:tc>
@@ -467,6 +467,83 @@
                 <w:sz w:val="18"/>
               </w:rPr>
               <w:t>L3 资源完整性（尺寸 + SHA-256）</w:t>
+            </w:r>
+          </w:p>
+        </w:tc>
+        <w:tc>
+          <w:tcPr>
+            <w:tcW w:type="dxa" w:w="964"/>
+          </w:tcPr>
+          <w:p>
+            <w:r/>
+            <w:r>
+              <w:rPr>
+                <w:rFonts w:ascii="微软雅黑" w:hAnsi="微软雅黑" w:eastAsia="微软雅黑" w:cs="微软雅黑"/>
+                <w:sz w:val="18"/>
+              </w:rPr>
+              <w:t>✓</w:t>
+            </w:r>
+          </w:p>
+        </w:tc>
+        <w:tc>
+          <w:tcPr>
+            <w:tcW w:type="dxa" w:w="964"/>
+          </w:tcPr>
+          <w:p>
+            <w:r/>
+            <w:r>
+              <w:rPr>
+                <w:rFonts w:ascii="微软雅黑" w:hAnsi="微软雅黑" w:eastAsia="微软雅黑" w:cs="微软雅黑"/>
+                <w:sz w:val="18"/>
+              </w:rPr>
+              <w:t>✓</w:t>
+            </w:r>
+          </w:p>
+        </w:tc>
+        <w:tc>
+          <w:tcPr>
+            <w:tcW w:type="dxa" w:w="964"/>
+          </w:tcPr>
+          <w:p>
+            <w:r/>
+            <w:r>
+              <w:rPr>
+                <w:rFonts w:ascii="微软雅黑" w:hAnsi="微软雅黑" w:eastAsia="微软雅黑" w:cs="微软雅黑"/>
+                <w:sz w:val="18"/>
+              </w:rPr>
+              <w:t>✓</w:t>
+            </w:r>
+          </w:p>
+        </w:tc>
+        <w:tc>
+          <w:tcPr>
+            <w:tcW w:type="dxa" w:w="2438"/>
+          </w:tcPr>
+          <w:p>
+            <w:r/>
+            <w:r>
+              <w:rPr>
+                <w:rFonts w:ascii="微软雅黑" w:hAnsi="微软雅黑" w:eastAsia="微软雅黑" w:cs="微软雅黑"/>
+                <w:sz w:val="18"/>
+              </w:rPr>
+              <w:t>✓</w:t>
+            </w:r>
+          </w:p>
+        </w:tc>
+      </w:tr>
+      <w:tr>
+        <w:tc>
+          <w:tcPr>
+            <w:tcW w:type="dxa" w:w="3628"/>
+          </w:tcPr>
+          <w:p>
+            <w:r/>
+            <w:r>
+              <w:rPr>
+                <w:rFonts w:ascii="微软雅黑" w:hAnsi="微软雅黑" w:eastAsia="微软雅黑" w:cs="微软雅黑"/>
+                <w:sz w:val="18"/>
+              </w:rPr>
+              <w:t>L4 Parquet 内容校验（CLI --l4）</w:t>
             </w:r>
           </w:p>
         </w:tc>
@@ -2139,7 +2216,7 @@
                 <w:rFonts w:ascii="微软雅黑" w:hAnsi="微软雅黑" w:eastAsia="微软雅黑" w:cs="微软雅黑"/>
                 <w:sz w:val="18"/>
               </w:rPr>
-              <w:t>17</w:t>
+              <w:t>20</w:t>
             </w:r>
           </w:p>
         </w:tc>
@@ -2154,7 +2231,7 @@
                 <w:rFonts w:ascii="微软雅黑" w:hAnsi="微软雅黑" w:eastAsia="微软雅黑" w:cs="微软雅黑"/>
                 <w:sz w:val="18"/>
               </w:rPr>
-              <w:t>校验退出码、--json、pack、unpack、容器校验</w:t>
+              <w:t>校验退出码、--json、pack、unpack、容器校验、--l4</w:t>
             </w:r>
           </w:p>
         </w:tc>
@@ -2186,7 +2263,7 @@
                 <w:rFonts w:ascii="微软雅黑" w:hAnsi="微软雅黑" w:eastAsia="微软雅黑" w:cs="微软雅黑"/>
                 <w:sz w:val="18"/>
               </w:rPr>
-              <w:t>217</w:t>
+              <w:t>220</w:t>
             </w:r>
           </w:p>
         </w:tc>
@@ -3759,38 +3836,6 @@
                 <w:rFonts w:ascii="微软雅黑" w:hAnsi="微软雅黑" w:eastAsia="微软雅黑" w:cs="微软雅黑"/>
                 <w:sz w:val="18"/>
               </w:rPr>
-              <w:t>CLI 的 L4 校验</w:t>
-            </w:r>
-          </w:p>
-        </w:tc>
-        <w:tc>
-          <w:tcPr>
-            <w:tcW w:type="dxa" w:w="5329"/>
-          </w:tcPr>
-          <w:p>
-            <w:r/>
-            <w:r>
-              <w:rPr>
-                <w:rFonts w:ascii="微软雅黑" w:hAnsi="微软雅黑" w:eastAsia="微软雅黑" w:cs="微软雅黑"/>
-                <w:sz w:val="18"/>
-              </w:rPr>
-              <w:t>目前只在 DuckDB Adapter 内做</w:t>
-            </w:r>
-          </w:p>
-        </w:tc>
-      </w:tr>
-      <w:tr>
-        <w:tc>
-          <w:tcPr>
-            <w:tcW w:type="dxa" w:w="3628"/>
-          </w:tcPr>
-          <w:p>
-            <w:r/>
-            <w:r>
-              <w:rPr>
-                <w:rFonts w:ascii="微软雅黑" w:hAnsi="微软雅黑" w:eastAsia="微软雅黑" w:cs="微软雅黑"/>
-                <w:sz w:val="18"/>
-              </w:rPr>
               <w:t>中文分词</w:t>
             </w:r>
           </w:p>
@@ -4358,7 +4403,7 @@
                 <w:rFonts w:ascii="微软雅黑" w:hAnsi="微软雅黑" w:eastAsia="微软雅黑" w:cs="微软雅黑"/>
                 <w:sz w:val="18"/>
               </w:rPr>
-              <w:t>✓ 217 测试，typecheck 通过</w:t>
+              <w:t>✓ 220 测试，typecheck 通过</w:t>
             </w:r>
           </w:p>
         </w:tc>
@@ -4626,7 +4671,7 @@
           <w:rFonts w:ascii="微软雅黑" w:hAnsi="微软雅黑" w:eastAsia="微软雅黑" w:cs="微软雅黑"/>
           <w:sz w:val="21"/>
         </w:rPr>
-        <w:t>4. 视需要再做 .wsql 压缩/流式或 CLI 的 L4 校验。</w:t>
+        <w:t>4. 视需要再做 .wsql 压缩/流式。</w:t>
       </w:r>
     </w:p>
     <w:sectPr>

</xml_diff>

<commit_message>
feat: stream .wsql containers and guard ANN index major versions
</commit_message>
<xml_diff>
--- a/docs/WeiSQL-项目状态报告.docx
+++ b/docs/WeiSQL-项目状态报告.docx
@@ -23,7 +23,7 @@
           <w:color w:val="595959"/>
           <w:sz w:val="20"/>
         </w:rPr>
-        <w:t>2026-10-31 · 仓库 HEAD f554b01 · 220 个自动化测试 · 尚未发布 npm</w:t>
+        <w:t>2026-10-31 · 仓库 HEAD 5e42b75 · 225 个自动化测试 · 尚未发布 npm</w:t>
       </w:r>
     </w:p>
     <w:p>
@@ -40,7 +40,7 @@
           <w:rFonts w:ascii="微软雅黑" w:hAnsi="微软雅黑" w:eastAsia="微软雅黑" w:cs="微软雅黑"/>
           <w:sz w:val="21"/>
         </w:rPr>
-        <w:t>工程原型。Manifest V1 与数据包格式稳定，四个包共 220 个自动化测试，CI 覆盖构建、类型、测试与发布元数据；精确检索、ANN、全文、融合、RAG 与单文件容器均有实现与实测数字。尚未发布 npm 包，也没有任何未经测量的性能承诺。</w:t>
+        <w:t>工程原型。Manifest V1 与数据包格式稳定，四个包共 225 个自动化测试，CI 覆盖构建、类型、测试与发布元数据；精确检索、ANN、全文、融合、RAG 与单文件容器均有实现与实测数字。尚未发布 npm 包，也没有任何未经测量的性能承诺。</w:t>
       </w:r>
     </w:p>
     <w:tbl>
@@ -124,7 +124,7 @@
                 <w:rFonts w:ascii="微软雅黑" w:hAnsi="微软雅黑" w:eastAsia="微软雅黑" w:cs="微软雅黑"/>
                 <w:sz w:val="18"/>
               </w:rPr>
-              <w:t>220 个全绿（SDK 169 / DuckDB 19 / USearch 12 / CLI 20）</w:t>
+              <w:t>225 个全绿（SDK 173 / DuckDB 19 / USearch 13 / CLI 20）</w:t>
             </w:r>
           </w:p>
         </w:tc>
@@ -1467,7 +1467,7 @@
                 <w:rFonts w:ascii="微软雅黑" w:hAnsi="微软雅黑" w:eastAsia="微软雅黑" w:cs="微软雅黑"/>
                 <w:sz w:val="18"/>
               </w:rPr>
-              <w:t>.wsql 单文件容器（pack/validate/unpack）</w:t>
+              <w:t>.wsql 单文件容器（pack/validate/unpack/流式）</w:t>
             </w:r>
           </w:p>
         </w:tc>
@@ -2075,7 +2075,7 @@
                 <w:rFonts w:ascii="微软雅黑" w:hAnsi="微软雅黑" w:eastAsia="微软雅黑" w:cs="微软雅黑"/>
                 <w:sz w:val="18"/>
               </w:rPr>
-              <w:t>169</w:t>
+              <w:t>173</w:t>
             </w:r>
           </w:p>
         </w:tc>
@@ -2169,7 +2169,7 @@
                 <w:rFonts w:ascii="微软雅黑" w:hAnsi="微软雅黑" w:eastAsia="微软雅黑" w:cs="微软雅黑"/>
                 <w:sz w:val="18"/>
               </w:rPr>
-              <w:t>12</w:t>
+              <w:t>13</w:t>
             </w:r>
           </w:p>
         </w:tc>
@@ -2263,7 +2263,7 @@
                 <w:rFonts w:ascii="微软雅黑" w:hAnsi="微软雅黑" w:eastAsia="微软雅黑" w:cs="微软雅黑"/>
                 <w:sz w:val="18"/>
               </w:rPr>
-              <w:t>220</w:t>
+              <w:t>225</w:t>
             </w:r>
           </w:p>
         </w:tc>
@@ -3708,7 +3708,7 @@
                 <w:rFonts w:ascii="微软雅黑" w:hAnsi="微软雅黑" w:eastAsia="微软雅黑" w:cs="微软雅黑"/>
                 <w:sz w:val="18"/>
               </w:rPr>
-              <w:t>索引与 Adapter 版本兼容</w:t>
+              <w:t>同主版本内的索引格式变化</w:t>
             </w:r>
           </w:p>
         </w:tc>
@@ -3723,7 +3723,7 @@
                 <w:rFonts w:ascii="微软雅黑" w:hAnsi="微软雅黑" w:eastAsia="微软雅黑" w:cs="微软雅黑"/>
                 <w:sz w:val="18"/>
               </w:rPr>
-              <w:t>只校验 engine 与向量数量</w:t>
+              <w:t>只按主版本判定，无法探测其内部变化</w:t>
             </w:r>
           </w:p>
         </w:tc>
@@ -3772,7 +3772,7 @@
                 <w:rFonts w:ascii="微软雅黑" w:hAnsi="微软雅黑" w:eastAsia="微软雅黑" w:cs="微软雅黑"/>
                 <w:sz w:val="18"/>
               </w:rPr>
-              <w:t>.wsql 压缩 / 流式</w:t>
+              <w:t>.wsql 压缩</w:t>
             </w:r>
           </w:p>
         </w:tc>
@@ -3787,7 +3787,7 @@
                 <w:rFonts w:ascii="微软雅黑" w:hAnsi="微软雅黑" w:eastAsia="微软雅黑" w:cs="微软雅黑"/>
                 <w:sz w:val="18"/>
               </w:rPr>
-              <w:t>V1 不压缩、整文件入内存</w:t>
+              <w:t>V1 不压缩；流式读取已实现</w:t>
             </w:r>
           </w:p>
         </w:tc>
@@ -4403,7 +4403,7 @@
                 <w:rFonts w:ascii="微软雅黑" w:hAnsi="微软雅黑" w:eastAsia="微软雅黑" w:cs="微软雅黑"/>
                 <w:sz w:val="18"/>
               </w:rPr>
-              <w:t>✓ 220 测试，typecheck 通过</w:t>
+              <w:t>✓ 225 测试，typecheck 通过</w:t>
             </w:r>
           </w:p>
         </w:tc>
@@ -4671,7 +4671,7 @@
           <w:rFonts w:ascii="微软雅黑" w:hAnsi="微软雅黑" w:eastAsia="微软雅黑" w:cs="微软雅黑"/>
           <w:sz w:val="21"/>
         </w:rPr>
-        <w:t>4. 视需要再做 .wsql 压缩/流式。</w:t>
+        <w:t>4. 视需要再做 .wsql 压缩。</w:t>
       </w:r>
     </w:p>
     <w:sectPr>

</xml_diff>

<commit_message>
feat: add gzip compression as container format 1.1.0
</commit_message>
<xml_diff>
--- a/docs/WeiSQL-项目状态报告.docx
+++ b/docs/WeiSQL-项目状态报告.docx
@@ -23,7 +23,7 @@
           <w:color w:val="595959"/>
           <w:sz w:val="20"/>
         </w:rPr>
-        <w:t>2026-10-31 · 仓库 HEAD 5e42b75 · 225 个自动化测试 · 尚未发布 npm</w:t>
+        <w:t>2026-10-31 · 仓库 HEAD ada5885 · 230 个自动化测试 · 尚未发布 npm</w:t>
       </w:r>
     </w:p>
     <w:p>
@@ -40,7 +40,7 @@
           <w:rFonts w:ascii="微软雅黑" w:hAnsi="微软雅黑" w:eastAsia="微软雅黑" w:cs="微软雅黑"/>
           <w:sz w:val="21"/>
         </w:rPr>
-        <w:t>工程原型。Manifest V1 与数据包格式稳定，四个包共 225 个自动化测试，CI 覆盖构建、类型、测试与发布元数据；精确检索、ANN、全文、融合、RAG 与单文件容器均有实现与实测数字。尚未发布 npm 包，也没有任何未经测量的性能承诺。</w:t>
+        <w:t>工程原型。Manifest V1 与数据包格式稳定，四个包共 230 个自动化测试，CI 覆盖构建、类型、测试与发布元数据；精确检索、ANN、全文、融合、RAG 与单文件容器均有实现与实测数字。尚未发布 npm 包，也没有任何未经测量的性能承诺。</w:t>
       </w:r>
     </w:p>
     <w:tbl>
@@ -124,7 +124,7 @@
                 <w:rFonts w:ascii="微软雅黑" w:hAnsi="微软雅黑" w:eastAsia="微软雅黑" w:cs="微软雅黑"/>
                 <w:sz w:val="18"/>
               </w:rPr>
-              <w:t>225 个全绿（SDK 173 / DuckDB 19 / USearch 13 / CLI 20）</w:t>
+              <w:t>230 个全绿（SDK 176 / DuckDB 19 / USearch 13 / CLI 22）</w:t>
             </w:r>
           </w:p>
         </w:tc>
@@ -2075,7 +2075,7 @@
                 <w:rFonts w:ascii="微软雅黑" w:hAnsi="微软雅黑" w:eastAsia="微软雅黑" w:cs="微软雅黑"/>
                 <w:sz w:val="18"/>
               </w:rPr>
-              <w:t>173</w:t>
+              <w:t>176</w:t>
             </w:r>
           </w:p>
         </w:tc>
@@ -2216,7 +2216,7 @@
                 <w:rFonts w:ascii="微软雅黑" w:hAnsi="微软雅黑" w:eastAsia="微软雅黑" w:cs="微软雅黑"/>
                 <w:sz w:val="18"/>
               </w:rPr>
-              <w:t>20</w:t>
+              <w:t>22</w:t>
             </w:r>
           </w:p>
         </w:tc>
@@ -2263,7 +2263,7 @@
                 <w:rFonts w:ascii="微软雅黑" w:hAnsi="微软雅黑" w:eastAsia="微软雅黑" w:cs="微软雅黑"/>
                 <w:sz w:val="18"/>
               </w:rPr>
-              <w:t>225</w:t>
+              <w:t>230</w:t>
             </w:r>
           </w:p>
         </w:tc>
@@ -3740,6 +3740,38 @@
                 <w:rFonts w:ascii="微软雅黑" w:hAnsi="微软雅黑" w:eastAsia="微软雅黑" w:cs="微软雅黑"/>
                 <w:sz w:val="18"/>
               </w:rPr>
+              <w:t>.wsql 压缩算法协商</w:t>
+            </w:r>
+          </w:p>
+        </w:tc>
+        <w:tc>
+          <w:tcPr>
+            <w:tcW w:type="dxa" w:w="5329"/>
+          </w:tcPr>
+          <w:p>
+            <w:r/>
+            <w:r>
+              <w:rPr>
+                <w:rFonts w:ascii="微软雅黑" w:hAnsi="微软雅黑" w:eastAsia="微软雅黑" w:cs="微软雅黑"/>
+                <w:sz w:val="18"/>
+              </w:rPr>
+              <w:t>目前只有 gzip；brotli 需要新版本号</w:t>
+            </w:r>
+          </w:p>
+        </w:tc>
+      </w:tr>
+      <w:tr>
+        <w:tc>
+          <w:tcPr>
+            <w:tcW w:type="dxa" w:w="3628"/>
+          </w:tcPr>
+          <w:p>
+            <w:r/>
+            <w:r>
+              <w:rPr>
+                <w:rFonts w:ascii="微软雅黑" w:hAnsi="微软雅黑" w:eastAsia="微软雅黑" w:cs="微软雅黑"/>
+                <w:sz w:val="18"/>
+              </w:rPr>
               <w:t>RRF 的 k 调优</w:t>
             </w:r>
           </w:p>
@@ -3756,38 +3788,6 @@
                 <w:sz w:val="18"/>
               </w:rPr>
               <w:t>使用文献默认 60，未做实验</w:t>
-            </w:r>
-          </w:p>
-        </w:tc>
-      </w:tr>
-      <w:tr>
-        <w:tc>
-          <w:tcPr>
-            <w:tcW w:type="dxa" w:w="3628"/>
-          </w:tcPr>
-          <w:p>
-            <w:r/>
-            <w:r>
-              <w:rPr>
-                <w:rFonts w:ascii="微软雅黑" w:hAnsi="微软雅黑" w:eastAsia="微软雅黑" w:cs="微软雅黑"/>
-                <w:sz w:val="18"/>
-              </w:rPr>
-              <w:t>.wsql 压缩</w:t>
-            </w:r>
-          </w:p>
-        </w:tc>
-        <w:tc>
-          <w:tcPr>
-            <w:tcW w:type="dxa" w:w="5329"/>
-          </w:tcPr>
-          <w:p>
-            <w:r/>
-            <w:r>
-              <w:rPr>
-                <w:rFonts w:ascii="微软雅黑" w:hAnsi="微软雅黑" w:eastAsia="微软雅黑" w:cs="微软雅黑"/>
-                <w:sz w:val="18"/>
-              </w:rPr>
-              <w:t>V1 不压缩；流式读取已实现</w:t>
             </w:r>
           </w:p>
         </w:tc>
@@ -4403,7 +4403,7 @@
                 <w:rFonts w:ascii="微软雅黑" w:hAnsi="微软雅黑" w:eastAsia="微软雅黑" w:cs="微软雅黑"/>
                 <w:sz w:val="18"/>
               </w:rPr>
-              <w:t>✓ 225 测试，typecheck 通过</w:t>
+              <w:t>✓ 230 测试，typecheck 通过</w:t>
             </w:r>
           </w:p>
         </w:tc>
@@ -4671,7 +4671,7 @@
           <w:rFonts w:ascii="微软雅黑" w:hAnsi="微软雅黑" w:eastAsia="微软雅黑" w:cs="微软雅黑"/>
           <w:sz w:val="21"/>
         </w:rPr>
-        <w:t>4. 视需要再做 .wsql 压缩。</w:t>
+        <w:t>4. 视需要再做压缩算法协商或 Builder 的 CSV/JSON 输入。</w:t>
       </w:r>
     </w:p>
     <w:sectPr>

</xml_diff>

<commit_message>
feat: convert CSV and JSON sources into Builder-ready Parquet
</commit_message>
<xml_diff>
--- a/docs/WeiSQL-项目状态报告.docx
+++ b/docs/WeiSQL-项目状态报告.docx
@@ -23,7 +23,7 @@
           <w:color w:val="595959"/>
           <w:sz w:val="20"/>
         </w:rPr>
-        <w:t>2026-10-31 · 仓库 HEAD ada5885 · 230 个自动化测试 · 尚未发布 npm</w:t>
+        <w:t>2026-10-31 · 仓库 HEAD eabb963 · 235 个自动化测试 · 尚未发布 npm</w:t>
       </w:r>
     </w:p>
     <w:p>
@@ -40,7 +40,7 @@
           <w:rFonts w:ascii="微软雅黑" w:hAnsi="微软雅黑" w:eastAsia="微软雅黑" w:cs="微软雅黑"/>
           <w:sz w:val="21"/>
         </w:rPr>
-        <w:t>工程原型。Manifest V1 与数据包格式稳定，四个包共 230 个自动化测试，CI 覆盖构建、类型、测试与发布元数据；精确检索、ANN、全文、融合、RAG 与单文件容器均有实现与实测数字。尚未发布 npm 包，也没有任何未经测量的性能承诺。</w:t>
+        <w:t>工程原型。Manifest V1 与数据包格式稳定，四个包共 235 个自动化测试，CI 覆盖构建、类型、测试与发布元数据；精确检索、ANN、全文、融合、RAG 与单文件容器均有实现与实测数字。尚未发布 npm 包，也没有任何未经测量的性能承诺。</w:t>
       </w:r>
     </w:p>
     <w:tbl>
@@ -124,7 +124,7 @@
                 <w:rFonts w:ascii="微软雅黑" w:hAnsi="微软雅黑" w:eastAsia="微软雅黑" w:cs="微软雅黑"/>
                 <w:sz w:val="18"/>
               </w:rPr>
-              <w:t>230 个全绿（SDK 176 / DuckDB 19 / USearch 13 / CLI 22）</w:t>
+              <w:t>235 个全绿（SDK 176 / DuckDB 19 / USearch 13 / CLI 27）</w:t>
             </w:r>
           </w:p>
         </w:tc>
@@ -1686,6 +1686,83 @@
           </w:p>
         </w:tc>
       </w:tr>
+      <w:tr>
+        <w:tc>
+          <w:tcPr>
+            <w:tcW w:type="dxa" w:w="3628"/>
+          </w:tcPr>
+          <w:p>
+            <w:r/>
+            <w:r>
+              <w:rPr>
+                <w:rFonts w:ascii="微软雅黑" w:hAnsi="微软雅黑" w:eastAsia="微软雅黑" w:cs="微软雅黑"/>
+                <w:sz w:val="18"/>
+              </w:rPr>
+              <w:t>CSV/JSON → Parquet 转换工具</w:t>
+            </w:r>
+          </w:p>
+        </w:tc>
+        <w:tc>
+          <w:tcPr>
+            <w:tcW w:type="dxa" w:w="964"/>
+          </w:tcPr>
+          <w:p>
+            <w:r/>
+            <w:r>
+              <w:rPr>
+                <w:rFonts w:ascii="微软雅黑" w:hAnsi="微软雅黑" w:eastAsia="微软雅黑" w:cs="微软雅黑"/>
+                <w:sz w:val="18"/>
+              </w:rPr>
+              <w:t>✓</w:t>
+            </w:r>
+          </w:p>
+        </w:tc>
+        <w:tc>
+          <w:tcPr>
+            <w:tcW w:type="dxa" w:w="964"/>
+          </w:tcPr>
+          <w:p>
+            <w:r/>
+            <w:r>
+              <w:rPr>
+                <w:rFonts w:ascii="微软雅黑" w:hAnsi="微软雅黑" w:eastAsia="微软雅黑" w:cs="微软雅黑"/>
+                <w:sz w:val="18"/>
+              </w:rPr>
+              <w:t>✓</w:t>
+            </w:r>
+          </w:p>
+        </w:tc>
+        <w:tc>
+          <w:tcPr>
+            <w:tcW w:type="dxa" w:w="964"/>
+          </w:tcPr>
+          <w:p>
+            <w:r/>
+            <w:r>
+              <w:rPr>
+                <w:rFonts w:ascii="微软雅黑" w:hAnsi="微软雅黑" w:eastAsia="微软雅黑" w:cs="微软雅黑"/>
+                <w:sz w:val="18"/>
+              </w:rPr>
+              <w:t>✓</w:t>
+            </w:r>
+          </w:p>
+        </w:tc>
+        <w:tc>
+          <w:tcPr>
+            <w:tcW w:type="dxa" w:w="2438"/>
+          </w:tcPr>
+          <w:p>
+            <w:r/>
+            <w:r>
+              <w:rPr>
+                <w:rFonts w:ascii="微软雅黑" w:hAnsi="微软雅黑" w:eastAsia="微软雅黑" w:cs="微软雅黑"/>
+                <w:sz w:val="18"/>
+              </w:rPr>
+              <w:t>✓</w:t>
+            </w:r>
+          </w:p>
+        </w:tc>
+      </w:tr>
     </w:tbl>
     <w:p>
       <w:pPr>
@@ -2216,7 +2293,7 @@
                 <w:rFonts w:ascii="微软雅黑" w:hAnsi="微软雅黑" w:eastAsia="微软雅黑" w:cs="微软雅黑"/>
                 <w:sz w:val="18"/>
               </w:rPr>
-              <w:t>22</w:t>
+              <w:t>27</w:t>
             </w:r>
           </w:p>
         </w:tc>
@@ -2263,7 +2340,7 @@
                 <w:rFonts w:ascii="微软雅黑" w:hAnsi="微软雅黑" w:eastAsia="微软雅黑" w:cs="微软雅黑"/>
                 <w:sz w:val="18"/>
               </w:rPr>
-              <w:t>230</w:t>
+              <w:t>235</w:t>
             </w:r>
           </w:p>
         </w:tc>
@@ -3804,7 +3881,7 @@
                 <w:rFonts w:ascii="微软雅黑" w:hAnsi="微软雅黑" w:eastAsia="微软雅黑" w:cs="微软雅黑"/>
                 <w:sz w:val="18"/>
               </w:rPr>
-              <w:t>Builder CSV/JSON 输入</w:t>
+              <w:t>时间戳与嵌套列的源数据推断</w:t>
             </w:r>
           </w:p>
         </w:tc>
@@ -3819,7 +3896,7 @@
                 <w:rFonts w:ascii="微软雅黑" w:hAnsi="微软雅黑" w:eastAsia="微软雅黑" w:cs="微软雅黑"/>
                 <w:sz w:val="18"/>
               </w:rPr>
-              <w:t>需要 Parquet 写入依赖，未引入</w:t>
+              <w:t>转换工具只覆盖标量类型</w:t>
             </w:r>
           </w:p>
         </w:tc>
@@ -4403,7 +4480,7 @@
                 <w:rFonts w:ascii="微软雅黑" w:hAnsi="微软雅黑" w:eastAsia="微软雅黑" w:cs="微软雅黑"/>
                 <w:sz w:val="18"/>
               </w:rPr>
-              <w:t>✓ 230 测试，typecheck 通过</w:t>
+              <w:t>✓ 235 测试，typecheck 通过</w:t>
             </w:r>
           </w:p>
         </w:tc>
@@ -4671,7 +4748,7 @@
           <w:rFonts w:ascii="微软雅黑" w:hAnsi="微软雅黑" w:eastAsia="微软雅黑" w:cs="微软雅黑"/>
           <w:sz w:val="21"/>
         </w:rPr>
-        <w:t>4. 视需要再做压缩算法协商或 Builder 的 CSV/JSON 输入。</w:t>
+        <w:t>4. 视需要再做压缩算法协商或源数据的时间戳推断。</w:t>
       </w:r>
     </w:p>
     <w:sectPr>

</xml_diff>

<commit_message>
bench: measure RRF k stability and document the limits
</commit_message>
<xml_diff>
--- a/docs/WeiSQL-项目状态报告.docx
+++ b/docs/WeiSQL-项目状态报告.docx
@@ -3849,7 +3849,7 @@
                 <w:rFonts w:ascii="微软雅黑" w:hAnsi="微软雅黑" w:eastAsia="微软雅黑" w:cs="微软雅黑"/>
                 <w:sz w:val="18"/>
               </w:rPr>
-              <w:t>RRF 的 k 调优</w:t>
+              <w:t>融合质量需要相关性标注</w:t>
             </w:r>
           </w:p>
         </w:tc>
@@ -3864,7 +3864,7 @@
                 <w:rFonts w:ascii="微软雅黑" w:hAnsi="微软雅黑" w:eastAsia="微软雅黑" w:cs="微软雅黑"/>
                 <w:sz w:val="18"/>
               </w:rPr>
-              <w:t>使用文献默认 60，未做实验</w:t>
+              <w:t>k 只做了稳定性测量，未回答哪个 k 排序更好</w:t>
             </w:r>
           </w:p>
         </w:tc>

</xml_diff>

<commit_message>
feat: extend vector filters with membership, ranges and date values
</commit_message>
<xml_diff>
--- a/docs/WeiSQL-项目状态报告.docx
+++ b/docs/WeiSQL-项目状态报告.docx
@@ -23,7 +23,7 @@
           <w:color w:val="595959"/>
           <w:sz w:val="20"/>
         </w:rPr>
-        <w:t>2026-10-31 · 仓库 HEAD eabb963 · 235 个自动化测试 · 尚未发布 npm</w:t>
+        <w:t>2026-10-31 · 仓库 HEAD ddee911 · 240 个自动化测试 · 尚未发布 npm</w:t>
       </w:r>
     </w:p>
     <w:p>
@@ -40,7 +40,7 @@
           <w:rFonts w:ascii="微软雅黑" w:hAnsi="微软雅黑" w:eastAsia="微软雅黑" w:cs="微软雅黑"/>
           <w:sz w:val="21"/>
         </w:rPr>
-        <w:t>工程原型。Manifest V1 与数据包格式稳定，四个包共 235 个自动化测试，CI 覆盖构建、类型、测试与发布元数据；精确检索、ANN、全文、融合、RAG 与单文件容器均有实现与实测数字。尚未发布 npm 包，也没有任何未经测量的性能承诺。</w:t>
+        <w:t>工程原型。Manifest V1 与数据包格式稳定，四个包共 240 个自动化测试，CI 覆盖构建、类型、测试与发布元数据；精确检索、ANN、全文、融合、RAG 与单文件容器均有实现与实测数字。尚未发布 npm 包，也没有任何未经测量的性能承诺。</w:t>
       </w:r>
     </w:p>
     <w:tbl>
@@ -124,7 +124,7 @@
                 <w:rFonts w:ascii="微软雅黑" w:hAnsi="微软雅黑" w:eastAsia="微软雅黑" w:cs="微软雅黑"/>
                 <w:sz w:val="18"/>
               </w:rPr>
-              <w:t>235 个全绿（SDK 176 / DuckDB 19 / USearch 13 / CLI 27）</w:t>
+              <w:t>240 个全绿（SDK 179 / DuckDB 20 / USearch 13 / CLI 27）</w:t>
             </w:r>
           </w:p>
         </w:tc>
@@ -928,7 +928,7 @@
                 <w:rFonts w:ascii="微软雅黑" w:hAnsi="微软雅黑" w:eastAsia="微软雅黑" w:cs="微软雅黑"/>
                 <w:sz w:val="18"/>
               </w:rPr>
-              <w:t>Hybrid 过滤两策略</w:t>
+              <w:t>Hybrid 过滤两策略（等值/IN/范围/日期）</w:t>
             </w:r>
           </w:p>
         </w:tc>
@@ -2152,7 +2152,7 @@
                 <w:rFonts w:ascii="微软雅黑" w:hAnsi="微软雅黑" w:eastAsia="微软雅黑" w:cs="微软雅黑"/>
                 <w:sz w:val="18"/>
               </w:rPr>
-              <w:t>176</w:t>
+              <w:t>179</w:t>
             </w:r>
           </w:p>
         </w:tc>
@@ -2199,7 +2199,7 @@
                 <w:rFonts w:ascii="微软雅黑" w:hAnsi="微软雅黑" w:eastAsia="微软雅黑" w:cs="微软雅黑"/>
                 <w:sz w:val="18"/>
               </w:rPr>
-              <w:t>19</w:t>
+              <w:t>20</w:t>
             </w:r>
           </w:p>
         </w:tc>
@@ -2340,7 +2340,7 @@
                 <w:rFonts w:ascii="微软雅黑" w:hAnsi="微软雅黑" w:eastAsia="微软雅黑" w:cs="微软雅黑"/>
                 <w:sz w:val="18"/>
               </w:rPr>
-              <w:t>235</w:t>
+              <w:t>240</w:t>
             </w:r>
           </w:p>
         </w:tc>
@@ -3849,6 +3849,38 @@
                 <w:rFonts w:ascii="微软雅黑" w:hAnsi="微软雅黑" w:eastAsia="微软雅黑" w:cs="微软雅黑"/>
                 <w:sz w:val="18"/>
               </w:rPr>
+              <w:t>JSON 等值过滤</w:t>
+            </w:r>
+          </w:p>
+        </w:tc>
+        <w:tc>
+          <w:tcPr>
+            <w:tcW w:type="dxa" w:w="5329"/>
+          </w:tcPr>
+          <w:p>
+            <w:r/>
+            <w:r>
+              <w:rPr>
+                <w:rFonts w:ascii="微软雅黑" w:hAnsi="微软雅黑" w:eastAsia="微软雅黑" w:cs="微软雅黑"/>
+                <w:sz w:val="18"/>
+              </w:rPr>
+              <w:t>需要规范化形式，当前明确拒绝</w:t>
+            </w:r>
+          </w:p>
+        </w:tc>
+      </w:tr>
+      <w:tr>
+        <w:tc>
+          <w:tcPr>
+            <w:tcW w:type="dxa" w:w="3628"/>
+          </w:tcPr>
+          <w:p>
+            <w:r/>
+            <w:r>
+              <w:rPr>
+                <w:rFonts w:ascii="微软雅黑" w:hAnsi="微软雅黑" w:eastAsia="微软雅黑" w:cs="微软雅黑"/>
+                <w:sz w:val="18"/>
+              </w:rPr>
               <w:t>融合质量需要相关性标注</w:t>
             </w:r>
           </w:p>
@@ -4480,7 +4512,7 @@
                 <w:rFonts w:ascii="微软雅黑" w:hAnsi="微软雅黑" w:eastAsia="微软雅黑" w:cs="微软雅黑"/>
                 <w:sz w:val="18"/>
               </w:rPr>
-              <w:t>✓ 235 测试，typecheck 通过</w:t>
+              <w:t>✓ 240 测试，typecheck 通过</w:t>
             </w:r>
           </w:p>
         </w:tc>

</xml_diff>

<commit_message>
docs: correct the test count in the status report
</commit_message>
<xml_diff>
--- a/docs/WeiSQL-项目状态报告.docx
+++ b/docs/WeiSQL-项目状态报告.docx
@@ -23,7 +23,7 @@
           <w:color w:val="595959"/>
           <w:sz w:val="20"/>
         </w:rPr>
-        <w:t>2026-10-31 · 仓库 HEAD ddee911 · 240 个自动化测试 · 尚未发布 npm</w:t>
+        <w:t>2026-10-31 · 仓库 HEAD ddee911 · 239 个自动化测试 · 尚未发布 npm</w:t>
       </w:r>
     </w:p>
     <w:p>
@@ -40,7 +40,7 @@
           <w:rFonts w:ascii="微软雅黑" w:hAnsi="微软雅黑" w:eastAsia="微软雅黑" w:cs="微软雅黑"/>
           <w:sz w:val="21"/>
         </w:rPr>
-        <w:t>工程原型。Manifest V1 与数据包格式稳定，四个包共 240 个自动化测试，CI 覆盖构建、类型、测试与发布元数据；精确检索、ANN、全文、融合、RAG 与单文件容器均有实现与实测数字。尚未发布 npm 包，也没有任何未经测量的性能承诺。</w:t>
+        <w:t>工程原型。Manifest V1 与数据包格式稳定，四个包共 239 个自动化测试，CI 覆盖构建、类型、测试与发布元数据；精确检索、ANN、全文、融合、RAG 与单文件容器均有实现与实测数字。尚未发布 npm 包，也没有任何未经测量的性能承诺。</w:t>
       </w:r>
     </w:p>
     <w:tbl>
@@ -124,7 +124,7 @@
                 <w:rFonts w:ascii="微软雅黑" w:hAnsi="微软雅黑" w:eastAsia="微软雅黑" w:cs="微软雅黑"/>
                 <w:sz w:val="18"/>
               </w:rPr>
-              <w:t>240 个全绿（SDK 179 / DuckDB 20 / USearch 13 / CLI 27）</w:t>
+              <w:t>239 个全绿（SDK 179 / DuckDB 20 / USearch 13 / CLI 27）</w:t>
             </w:r>
           </w:p>
         </w:tc>
@@ -2340,7 +2340,7 @@
                 <w:rFonts w:ascii="微软雅黑" w:hAnsi="微软雅黑" w:eastAsia="微软雅黑" w:cs="微软雅黑"/>
                 <w:sz w:val="18"/>
               </w:rPr>
-              <w:t>240</w:t>
+              <w:t>239</w:t>
             </w:r>
           </w:p>
         </w:tc>
@@ -4512,7 +4512,7 @@
                 <w:rFonts w:ascii="微软雅黑" w:hAnsi="微软雅黑" w:eastAsia="微软雅黑" w:cs="微软雅黑"/>
                 <w:sz w:val="18"/>
               </w:rPr>
-              <w:t>✓ 240 测试，typecheck 通过</w:t>
+              <w:t>✓ 239 测试，typecheck 通过</w:t>
             </w:r>
           </w:p>
         </w:tc>

</xml_diff>

<commit_message>
feat: sign and verify Manifests with Ed25519
</commit_message>
<xml_diff>
--- a/docs/WeiSQL-项目状态报告.docx
+++ b/docs/WeiSQL-项目状态报告.docx
@@ -23,7 +23,7 @@
           <w:color w:val="595959"/>
           <w:sz w:val="20"/>
         </w:rPr>
-        <w:t>2026-10-31 · 仓库 HEAD ddee911 · 239 个自动化测试 · 尚未发布 npm</w:t>
+        <w:t>2026-10-31 · 仓库 HEAD c267b0e · 247 个自动化测试 · 尚未发布 npm</w:t>
       </w:r>
     </w:p>
     <w:p>
@@ -40,7 +40,7 @@
           <w:rFonts w:ascii="微软雅黑" w:hAnsi="微软雅黑" w:eastAsia="微软雅黑" w:cs="微软雅黑"/>
           <w:sz w:val="21"/>
         </w:rPr>
-        <w:t>工程原型。Manifest V1 与数据包格式稳定，四个包共 239 个自动化测试，CI 覆盖构建、类型、测试与发布元数据；精确检索、ANN、全文、融合、RAG 与单文件容器均有实现与实测数字。尚未发布 npm 包，也没有任何未经测量的性能承诺。</w:t>
+        <w:t>工程原型。Manifest V1 与数据包格式稳定，四个包共 247 个自动化测试，CI 覆盖构建、类型、测试与发布元数据；精确检索、ANN、全文、融合、RAG 与单文件容器均有实现与实测数字。尚未发布 npm 包，也没有任何未经测量的性能承诺。</w:t>
       </w:r>
     </w:p>
     <w:tbl>
@@ -124,7 +124,7 @@
                 <w:rFonts w:ascii="微软雅黑" w:hAnsi="微软雅黑" w:eastAsia="微软雅黑" w:cs="微软雅黑"/>
                 <w:sz w:val="18"/>
               </w:rPr>
-              <w:t>239 个全绿（SDK 179 / DuckDB 20 / USearch 13 / CLI 27）</w:t>
+              <w:t>247 个全绿（SDK 183 / DuckDB 20 / USearch 13 / CLI 31）</w:t>
             </w:r>
           </w:p>
         </w:tc>
@@ -1544,6 +1544,83 @@
                 <w:rFonts w:ascii="微软雅黑" w:hAnsi="微软雅黑" w:eastAsia="微软雅黑" w:cs="微软雅黑"/>
                 <w:sz w:val="18"/>
               </w:rPr>
+              <w:t>Manifest Ed25519 签名</w:t>
+            </w:r>
+          </w:p>
+        </w:tc>
+        <w:tc>
+          <w:tcPr>
+            <w:tcW w:type="dxa" w:w="964"/>
+          </w:tcPr>
+          <w:p>
+            <w:r/>
+            <w:r>
+              <w:rPr>
+                <w:rFonts w:ascii="微软雅黑" w:hAnsi="微软雅黑" w:eastAsia="微软雅黑" w:cs="微软雅黑"/>
+                <w:sz w:val="18"/>
+              </w:rPr>
+              <w:t>✓</w:t>
+            </w:r>
+          </w:p>
+        </w:tc>
+        <w:tc>
+          <w:tcPr>
+            <w:tcW w:type="dxa" w:w="964"/>
+          </w:tcPr>
+          <w:p>
+            <w:r/>
+            <w:r>
+              <w:rPr>
+                <w:rFonts w:ascii="微软雅黑" w:hAnsi="微软雅黑" w:eastAsia="微软雅黑" w:cs="微软雅黑"/>
+                <w:sz w:val="18"/>
+              </w:rPr>
+              <w:t>✓</w:t>
+            </w:r>
+          </w:p>
+        </w:tc>
+        <w:tc>
+          <w:tcPr>
+            <w:tcW w:type="dxa" w:w="964"/>
+          </w:tcPr>
+          <w:p>
+            <w:r/>
+            <w:r>
+              <w:rPr>
+                <w:rFonts w:ascii="微软雅黑" w:hAnsi="微软雅黑" w:eastAsia="微软雅黑" w:cs="微软雅黑"/>
+                <w:sz w:val="18"/>
+              </w:rPr>
+              <w:t>✓</w:t>
+            </w:r>
+          </w:p>
+        </w:tc>
+        <w:tc>
+          <w:tcPr>
+            <w:tcW w:type="dxa" w:w="2438"/>
+          </w:tcPr>
+          <w:p>
+            <w:r/>
+            <w:r>
+              <w:rPr>
+                <w:rFonts w:ascii="微软雅黑" w:hAnsi="微软雅黑" w:eastAsia="微软雅黑" w:cs="微软雅黑"/>
+                <w:sz w:val="18"/>
+              </w:rPr>
+              <w:t>篡改与信任固定均拒绝</w:t>
+            </w:r>
+          </w:p>
+        </w:tc>
+      </w:tr>
+      <w:tr>
+        <w:tc>
+          <w:tcPr>
+            <w:tcW w:type="dxa" w:w="3628"/>
+          </w:tcPr>
+          <w:p>
+            <w:r/>
+            <w:r>
+              <w:rPr>
+                <w:rFonts w:ascii="微软雅黑" w:hAnsi="微软雅黑" w:eastAsia="微软雅黑" w:cs="微软雅黑"/>
+                <w:sz w:val="18"/>
+              </w:rPr>
               <w:t>浏览器路径（Chromium）</w:t>
             </w:r>
           </w:p>
@@ -2152,7 +2229,7 @@
                 <w:rFonts w:ascii="微软雅黑" w:hAnsi="微软雅黑" w:eastAsia="微软雅黑" w:cs="微软雅黑"/>
                 <w:sz w:val="18"/>
               </w:rPr>
-              <w:t>179</w:t>
+              <w:t>183</w:t>
             </w:r>
           </w:p>
         </w:tc>
@@ -2293,7 +2370,7 @@
                 <w:rFonts w:ascii="微软雅黑" w:hAnsi="微软雅黑" w:eastAsia="微软雅黑" w:cs="微软雅黑"/>
                 <w:sz w:val="18"/>
               </w:rPr>
-              <w:t>27</w:t>
+              <w:t>31</w:t>
             </w:r>
           </w:p>
         </w:tc>
@@ -2340,7 +2417,7 @@
                 <w:rFonts w:ascii="微软雅黑" w:hAnsi="微软雅黑" w:eastAsia="微软雅黑" w:cs="微软雅黑"/>
                 <w:sz w:val="18"/>
               </w:rPr>
-              <w:t>239</w:t>
+              <w:t>247</w:t>
             </w:r>
           </w:p>
         </w:tc>
@@ -4512,7 +4589,7 @@
                 <w:rFonts w:ascii="微软雅黑" w:hAnsi="微软雅黑" w:eastAsia="微软雅黑" w:cs="微软雅黑"/>
                 <w:sz w:val="18"/>
               </w:rPr>
-              <w:t>✓ 239 测试，typecheck 通过</w:t>
+              <w:t>✓ 247 测试，typecheck 通过</w:t>
             </w:r>
           </w:p>
         </w:tc>

</xml_diff>

<commit_message>
feat: add package inspection and only-declared packing
</commit_message>
<xml_diff>
--- a/docs/WeiSQL-项目状态报告.docx
+++ b/docs/WeiSQL-项目状态报告.docx
@@ -40,7 +40,7 @@
           <w:rFonts w:ascii="微软雅黑" w:hAnsi="微软雅黑" w:eastAsia="微软雅黑" w:cs="微软雅黑"/>
           <w:sz w:val="21"/>
         </w:rPr>
-        <w:t>工程原型。Manifest V1 与数据包格式稳定，四个包共 247 个自动化测试，CI 覆盖构建、类型、测试与发布元数据；精确检索、ANN、全文、融合、RAG 与单文件容器均有实现与实测数字。尚未发布 npm 包，也没有任何未经测量的性能承诺。</w:t>
+        <w:t>工程原型。Manifest V1 与数据包格式稳定，四个包共 250 个自动化测试，CI 覆盖构建、类型、测试与发布元数据；精确检索、ANN、全文、融合、RAG 与单文件容器均有实现与实测数字。尚未发布 npm 包，也没有任何未经测量的性能承诺。</w:t>
       </w:r>
     </w:p>
     <w:tbl>
@@ -124,7 +124,7 @@
                 <w:rFonts w:ascii="微软雅黑" w:hAnsi="微软雅黑" w:eastAsia="微软雅黑" w:cs="微软雅黑"/>
                 <w:sz w:val="18"/>
               </w:rPr>
-              <w:t>247 个全绿（SDK 183 / DuckDB 20 / USearch 13 / CLI 31）</w:t>
+              <w:t>250 个全绿（SDK 183 / DuckDB 20 / USearch 13 / CLI 34）</w:t>
             </w:r>
           </w:p>
         </w:tc>
@@ -2370,7 +2370,7 @@
                 <w:rFonts w:ascii="微软雅黑" w:hAnsi="微软雅黑" w:eastAsia="微软雅黑" w:cs="微软雅黑"/>
                 <w:sz w:val="18"/>
               </w:rPr>
-              <w:t>31</w:t>
+              <w:t>34</w:t>
             </w:r>
           </w:p>
         </w:tc>
@@ -2417,7 +2417,7 @@
                 <w:rFonts w:ascii="微软雅黑" w:hAnsi="微软雅黑" w:eastAsia="微软雅黑" w:cs="微软雅黑"/>
                 <w:sz w:val="18"/>
               </w:rPr>
-              <w:t>247</w:t>
+              <w:t>250</w:t>
             </w:r>
           </w:p>
         </w:tc>
@@ -4589,7 +4589,7 @@
                 <w:rFonts w:ascii="微软雅黑" w:hAnsi="微软雅黑" w:eastAsia="微软雅黑" w:cs="微软雅黑"/>
                 <w:sz w:val="18"/>
               </w:rPr>
-              <w:t>✓ 247 测试，typecheck 通过</w:t>
+              <w:t>✓ 250 测试，typecheck 通过</w:t>
             </w:r>
           </w:p>
         </w:tc>

</xml_diff>

<commit_message>
perf: read only allowed rows for narrow filtered scans
</commit_message>
<xml_diff>
--- a/docs/WeiSQL-项目状态报告.docx
+++ b/docs/WeiSQL-项目状态报告.docx
@@ -40,7 +40,7 @@
           <w:rFonts w:ascii="微软雅黑" w:hAnsi="微软雅黑" w:eastAsia="微软雅黑" w:cs="微软雅黑"/>
           <w:sz w:val="21"/>
         </w:rPr>
-        <w:t>工程原型。Manifest V1 与数据包格式稳定，四个包共 250 个自动化测试，CI 覆盖构建、类型、测试与发布元数据；精确检索、ANN、全文、融合、RAG 与单文件容器均有实现与实测数字。尚未发布 npm 包，也没有任何未经测量的性能承诺。</w:t>
+        <w:t>工程原型。Manifest V1 与数据包格式稳定，四个包共 252 个自动化测试，CI 覆盖构建、类型、测试与发布元数据；精确检索、ANN、全文、融合、RAG 与单文件容器均有实现与实测数字。尚未发布 npm 包，也没有任何未经测量的性能承诺。</w:t>
       </w:r>
     </w:p>
     <w:tbl>
@@ -124,7 +124,7 @@
                 <w:rFonts w:ascii="微软雅黑" w:hAnsi="微软雅黑" w:eastAsia="微软雅黑" w:cs="微软雅黑"/>
                 <w:sz w:val="18"/>
               </w:rPr>
-              <w:t>250 个全绿（SDK 183 / DuckDB 20 / USearch 13 / CLI 34）</w:t>
+              <w:t>252 个全绿（SDK 185 / DuckDB 20 / USearch 13 / CLI 34）</w:t>
             </w:r>
           </w:p>
         </w:tc>
@@ -2229,7 +2229,7 @@
                 <w:rFonts w:ascii="微软雅黑" w:hAnsi="微软雅黑" w:eastAsia="微软雅黑" w:cs="微软雅黑"/>
                 <w:sz w:val="18"/>
               </w:rPr>
-              <w:t>183</w:t>
+              <w:t>185</w:t>
             </w:r>
           </w:p>
         </w:tc>
@@ -2417,7 +2417,7 @@
                 <w:rFonts w:ascii="微软雅黑" w:hAnsi="微软雅黑" w:eastAsia="微软雅黑" w:cs="微软雅黑"/>
                 <w:sz w:val="18"/>
               </w:rPr>
-              <w:t>250</w:t>
+              <w:t>252</w:t>
             </w:r>
           </w:p>
         </w:tc>
@@ -4589,7 +4589,7 @@
                 <w:rFonts w:ascii="微软雅黑" w:hAnsi="微软雅黑" w:eastAsia="微软雅黑" w:cs="微软雅黑"/>
                 <w:sz w:val="18"/>
               </w:rPr>
-              <w:t>✓ 250 测试，typecheck 通过</w:t>
+              <w:t>✓ 252 测试，typecheck 通过</w:t>
             </w:r>
           </w:p>
         </w:tc>

</xml_diff>

<commit_message>
feat: sign the Manifest during Builder publication
</commit_message>
<xml_diff>
--- a/docs/WeiSQL-项目状态报告.docx
+++ b/docs/WeiSQL-项目状态报告.docx
@@ -40,7 +40,7 @@
           <w:rFonts w:ascii="微软雅黑" w:hAnsi="微软雅黑" w:eastAsia="微软雅黑" w:cs="微软雅黑"/>
           <w:sz w:val="21"/>
         </w:rPr>
-        <w:t>工程原型。Manifest V1 与数据包格式稳定，四个包共 252 个自动化测试，CI 覆盖构建、类型、测试与发布元数据；精确检索、ANN、全文、融合、RAG 与单文件容器均有实现与实测数字。尚未发布 npm 包，也没有任何未经测量的性能承诺。</w:t>
+        <w:t>工程原型。Manifest V1 与数据包格式稳定，五个包共 273 个自动化测试，CI 覆盖构建、类型、测试与发布元数据；精确检索、ANN、全文、融合、RAG 与单文件容器均有实现与实测数字。尚未发布 npm 包，也没有任何未经测量的性能承诺。</w:t>
       </w:r>
     </w:p>
     <w:tbl>
@@ -124,7 +124,7 @@
                 <w:rFonts w:ascii="微软雅黑" w:hAnsi="微软雅黑" w:eastAsia="微软雅黑" w:cs="微软雅黑"/>
                 <w:sz w:val="18"/>
               </w:rPr>
-              <w:t>252 个全绿（SDK 185 / DuckDB 20 / USearch 13 / CLI 34）</w:t>
+              <w:t>273 个全绿（SDK 187 / DuckDB 20 / WASM 19 / USearch 13 / CLI 34）</w:t>
             </w:r>
           </w:p>
         </w:tc>
@@ -2229,7 +2229,7 @@
                 <w:rFonts w:ascii="微软雅黑" w:hAnsi="微软雅黑" w:eastAsia="微软雅黑" w:cs="微软雅黑"/>
                 <w:sz w:val="18"/>
               </w:rPr>
-              <w:t>185</w:t>
+              <w:t>187</w:t>
             </w:r>
           </w:p>
         </w:tc>
@@ -2292,6 +2292,53 @@
                 <w:sz w:val="18"/>
               </w:rPr>
               <w:t>只读边界、参数绑定、两种表加载、取消</w:t>
+            </w:r>
+          </w:p>
+        </w:tc>
+      </w:tr>
+      <w:tr>
+        <w:tc>
+          <w:tcPr>
+            <w:tcW w:type="dxa" w:w="2608"/>
+          </w:tcPr>
+          <w:p>
+            <w:r/>
+            <w:r>
+              <w:rPr>
+                <w:rFonts w:ascii="微软雅黑" w:hAnsi="微软雅黑" w:eastAsia="微软雅黑" w:cs="微软雅黑"/>
+                <w:sz w:val="18"/>
+              </w:rPr>
+              <w:t>@weisql/duckdb-wasm-adapter</w:t>
+            </w:r>
+          </w:p>
+        </w:tc>
+        <w:tc>
+          <w:tcPr>
+            <w:tcW w:type="dxa" w:w="1020"/>
+          </w:tcPr>
+          <w:p>
+            <w:r/>
+            <w:r>
+              <w:rPr>
+                <w:rFonts w:ascii="微软雅黑" w:hAnsi="微软雅黑" w:eastAsia="微软雅黑" w:cs="微软雅黑"/>
+                <w:sz w:val="18"/>
+              </w:rPr>
+              <w:t>19</w:t>
+            </w:r>
+          </w:p>
+        </w:tc>
+        <w:tc>
+          <w:tcPr>
+            <w:tcW w:type="dxa" w:w="5329"/>
+          </w:tcPr>
+          <w:p>
+            <w:r/>
+            <w:r>
+              <w:rPr>
+                <w:rFonts w:ascii="微软雅黑" w:hAnsi="微软雅黑" w:eastAsia="微软雅黑" w:cs="微软雅黑"/>
+                <w:sz w:val="18"/>
+              </w:rPr>
+              <w:t>关键字白名单、参数类型收窄、真实 WASM 引擎集成</w:t>
             </w:r>
           </w:p>
         </w:tc>
@@ -2417,7 +2464,7 @@
                 <w:rFonts w:ascii="微软雅黑" w:hAnsi="微软雅黑" w:eastAsia="微软雅黑" w:cs="微软雅黑"/>
                 <w:sz w:val="18"/>
               </w:rPr>
-              <w:t>252</w:t>
+              <w:t>273</w:t>
             </w:r>
           </w:p>
         </w:tc>
@@ -4589,7 +4636,7 @@
                 <w:rFonts w:ascii="微软雅黑" w:hAnsi="微软雅黑" w:eastAsia="微软雅黑" w:cs="微软雅黑"/>
                 <w:sz w:val="18"/>
               </w:rPr>
-              <w:t>✓ 252 测试，typecheck 通过</w:t>
+              <w:t>✓ 273 测试，typecheck 通过</w:t>
             </w:r>
           </w:p>
         </w:tc>

</xml_diff>

<commit_message>
bench: measure filtered-search I/O and latency
</commit_message>
<xml_diff>
--- a/docs/WeiSQL-项目状态报告.docx
+++ b/docs/WeiSQL-项目状态报告.docx
@@ -2942,6 +2942,68 @@
                 <w:rFonts w:ascii="微软雅黑" w:hAnsi="微软雅黑" w:eastAsia="微软雅黑" w:cs="微软雅黑"/>
                 <w:sz w:val="18"/>
               </w:rPr>
+              <w:t>过滤查询向量读取</w:t>
+            </w:r>
+          </w:p>
+        </w:tc>
+        <w:tc>
+          <w:tcPr>
+            <w:tcW w:type="dxa" w:w="2154"/>
+          </w:tcPr>
+          <w:p>
+            <w:r/>
+            <w:r>
+              <w:rPr>
+                <w:rFonts w:ascii="微软雅黑" w:hAnsi="微软雅黑" w:eastAsia="微软雅黑" w:cs="微软雅黑"/>
+                <w:sz w:val="18"/>
+              </w:rPr>
+              <w:t>51.2 → 0.51 MB</w:t>
+            </w:r>
+          </w:p>
+        </w:tc>
+        <w:tc>
+          <w:tcPr>
+            <w:tcW w:type="dxa" w:w="3061"/>
+          </w:tcPr>
+          <w:p>
+            <w:r/>
+            <w:r>
+              <w:rPr>
+                <w:rFonts w:ascii="微软雅黑" w:hAnsi="微软雅黑" w:eastAsia="微软雅黑" w:cs="微软雅黑"/>
+                <w:sz w:val="18"/>
+              </w:rPr>
+              <w:t>100k 行，窄过滤</w:t>
+            </w:r>
+          </w:p>
+        </w:tc>
+        <w:tc>
+          <w:tcPr>
+            <w:tcW w:type="dxa" w:w="1701"/>
+          </w:tcPr>
+          <w:p>
+            <w:r/>
+            <w:r>
+              <w:rPr>
+                <w:rFonts w:ascii="微软雅黑" w:hAnsi="微软雅黑" w:eastAsia="微软雅黑" w:cs="微软雅黑"/>
+                <w:sz w:val="18"/>
+              </w:rPr>
+              <w:t>端到端仍 327 ms：SQL + ID Map 固定成本</w:t>
+            </w:r>
+          </w:p>
+        </w:tc>
+      </w:tr>
+      <w:tr>
+        <w:tc>
+          <w:tcPr>
+            <w:tcW w:type="dxa" w:w="2041"/>
+          </w:tcPr>
+          <w:p>
+            <w:r/>
+            <w:r>
+              <w:rPr>
+                <w:rFonts w:ascii="微软雅黑" w:hAnsi="微软雅黑" w:eastAsia="微软雅黑" w:cs="微软雅黑"/>
+                <w:sz w:val="18"/>
+              </w:rPr>
               <w:t>全文索引体积</w:t>
             </w:r>
           </w:p>

</xml_diff>

<commit_message>
feat: persist a sorted ID index for filtered search
</commit_message>
<xml_diff>
--- a/docs/WeiSQL-项目状态报告.docx
+++ b/docs/WeiSQL-项目状态报告.docx
@@ -40,7 +40,7 @@
           <w:rFonts w:ascii="微软雅黑" w:hAnsi="微软雅黑" w:eastAsia="微软雅黑" w:cs="微软雅黑"/>
           <w:sz w:val="21"/>
         </w:rPr>
-        <w:t>工程原型。Manifest V1 与数据包格式稳定，五个包共 273 个自动化测试，CI 覆盖构建、类型、测试与发布元数据；精确检索、ANN、全文、融合、RAG 与单文件容器均有实现与实测数字。尚未发布 npm 包，也没有任何未经测量的性能承诺。</w:t>
+        <w:t>工程原型。Manifest V1 与数据包格式稳定，五个包共 284 个自动化测试，CI 覆盖构建、类型、测试与发布元数据；精确检索、ANN、全文、融合、RAG 与单文件容器均有实现与实测数字。尚未发布 npm 包，也没有任何未经测量的性能承诺。</w:t>
       </w:r>
     </w:p>
     <w:tbl>
@@ -124,7 +124,7 @@
                 <w:rFonts w:ascii="微软雅黑" w:hAnsi="微软雅黑" w:eastAsia="微软雅黑" w:cs="微软雅黑"/>
                 <w:sz w:val="18"/>
               </w:rPr>
-              <w:t>273 个全绿（SDK 187 / DuckDB 20 / WASM 19 / USearch 13 / CLI 34）</w:t>
+              <w:t>284 个全绿（SDK 190 / DuckDB 20 / WASM 27 / USearch 13 / CLI 34）</w:t>
             </w:r>
           </w:p>
         </w:tc>
@@ -2229,7 +2229,7 @@
                 <w:rFonts w:ascii="微软雅黑" w:hAnsi="微软雅黑" w:eastAsia="微软雅黑" w:cs="微软雅黑"/>
                 <w:sz w:val="18"/>
               </w:rPr>
-              <w:t>187</w:t>
+              <w:t>190</w:t>
             </w:r>
           </w:p>
         </w:tc>
@@ -2323,7 +2323,7 @@
                 <w:rFonts w:ascii="微软雅黑" w:hAnsi="微软雅黑" w:eastAsia="微软雅黑" w:cs="微软雅黑"/>
                 <w:sz w:val="18"/>
               </w:rPr>
-              <w:t>19</w:t>
+              <w:t>27</w:t>
             </w:r>
           </w:p>
         </w:tc>
@@ -2464,7 +2464,7 @@
                 <w:rFonts w:ascii="微软雅黑" w:hAnsi="微软雅黑" w:eastAsia="微软雅黑" w:cs="微软雅黑"/>
                 <w:sz w:val="18"/>
               </w:rPr>
-              <w:t>273</w:t>
+              <w:t>284</w:t>
             </w:r>
           </w:p>
         </w:tc>
@@ -2942,7 +2942,7 @@
                 <w:rFonts w:ascii="微软雅黑" w:hAnsi="微软雅黑" w:eastAsia="微软雅黑" w:cs="微软雅黑"/>
                 <w:sz w:val="18"/>
               </w:rPr>
-              <w:t>过滤查询向量读取</w:t>
+              <w:t>过滤查询（窄过滤）</w:t>
             </w:r>
           </w:p>
         </w:tc>
@@ -2957,7 +2957,7 @@
                 <w:rFonts w:ascii="微软雅黑" w:hAnsi="微软雅黑" w:eastAsia="微软雅黑" w:cs="微软雅黑"/>
                 <w:sz w:val="18"/>
               </w:rPr>
-              <w:t>51.2 → 0.51 MB</w:t>
+              <w:t>p50 17.1 ms</w:t>
             </w:r>
           </w:p>
         </w:tc>
@@ -2972,7 +2972,7 @@
                 <w:rFonts w:ascii="微软雅黑" w:hAnsi="微软雅黑" w:eastAsia="微软雅黑" w:cs="微软雅黑"/>
                 <w:sz w:val="18"/>
               </w:rPr>
-              <w:t>100k 行，窄过滤</w:t>
+              <w:t>100k 行，尾部 1000 行</w:t>
             </w:r>
           </w:p>
         </w:tc>
@@ -2987,7 +2987,7 @@
                 <w:rFonts w:ascii="微软雅黑" w:hAnsi="微软雅黑" w:eastAsia="微软雅黑" w:cs="微软雅黑"/>
                 <w:sz w:val="18"/>
               </w:rPr>
-              <w:t>端到端仍 327 ms：SQL + ID Map 固定成本</w:t>
+              <w:t>反向索引把 ID Map 读取从 4.0 MB 降到 480 B</w:t>
             </w:r>
           </w:p>
         </w:tc>
@@ -4698,7 +4698,7 @@
                 <w:rFonts w:ascii="微软雅黑" w:hAnsi="微软雅黑" w:eastAsia="微软雅黑" w:cs="微软雅黑"/>
                 <w:sz w:val="18"/>
               </w:rPr>
-              <w:t>✓ 273 测试，typecheck 通过</w:t>
+              <w:t>✓ 284 测试，typecheck 通过</w:t>
             </w:r>
           </w:p>
         </w:tc>

</xml_diff>

<commit_message>
fix: cover the id index in L3 verification and declared resources
</commit_message>
<xml_diff>
--- a/docs/WeiSQL-项目状态报告.docx
+++ b/docs/WeiSQL-项目状态报告.docx
@@ -40,7 +40,7 @@
           <w:rFonts w:ascii="微软雅黑" w:hAnsi="微软雅黑" w:eastAsia="微软雅黑" w:cs="微软雅黑"/>
           <w:sz w:val="21"/>
         </w:rPr>
-        <w:t>工程原型。Manifest V1 与数据包格式稳定，五个包共 284 个自动化测试，CI 覆盖构建、类型、测试与发布元数据；精确检索、ANN、全文、融合、RAG 与单文件容器均有实现与实测数字。尚未发布 npm 包，也没有任何未经测量的性能承诺。</w:t>
+        <w:t>工程原型。Manifest V1 与数据包格式稳定，五个包共 287 个自动化测试，CI 覆盖构建、类型、测试与发布元数据；精确检索、ANN、全文、融合、RAG 与单文件容器均有实现与实测数字。尚未发布 npm 包，也没有任何未经测量的性能承诺。</w:t>
       </w:r>
     </w:p>
     <w:tbl>
@@ -124,7 +124,7 @@
                 <w:rFonts w:ascii="微软雅黑" w:hAnsi="微软雅黑" w:eastAsia="微软雅黑" w:cs="微软雅黑"/>
                 <w:sz w:val="18"/>
               </w:rPr>
-              <w:t>284 个全绿（SDK 190 / DuckDB 20 / WASM 27 / USearch 13 / CLI 34）</w:t>
+              <w:t>287 个全绿（SDK 191 / DuckDB 20 / WASM 29 / USearch 13 / CLI 34）</w:t>
             </w:r>
           </w:p>
         </w:tc>
@@ -2229,7 +2229,7 @@
                 <w:rFonts w:ascii="微软雅黑" w:hAnsi="微软雅黑" w:eastAsia="微软雅黑" w:cs="微软雅黑"/>
                 <w:sz w:val="18"/>
               </w:rPr>
-              <w:t>190</w:t>
+              <w:t>191</w:t>
             </w:r>
           </w:p>
         </w:tc>
@@ -2323,7 +2323,7 @@
                 <w:rFonts w:ascii="微软雅黑" w:hAnsi="微软雅黑" w:eastAsia="微软雅黑" w:cs="微软雅黑"/>
                 <w:sz w:val="18"/>
               </w:rPr>
-              <w:t>27</w:t>
+              <w:t>29</w:t>
             </w:r>
           </w:p>
         </w:tc>
@@ -2464,7 +2464,7 @@
                 <w:rFonts w:ascii="微软雅黑" w:hAnsi="微软雅黑" w:eastAsia="微软雅黑" w:cs="微软雅黑"/>
                 <w:sz w:val="18"/>
               </w:rPr>
-              <w:t>284</w:t>
+              <w:t>287</w:t>
             </w:r>
           </w:p>
         </w:tc>
@@ -4698,7 +4698,7 @@
                 <w:rFonts w:ascii="微软雅黑" w:hAnsi="微软雅黑" w:eastAsia="微软雅黑" w:cs="微软雅黑"/>
                 <w:sz w:val="18"/>
               </w:rPr>
-              <w:t>✓ 284 测试，typecheck 通过</w:t>
+              <w:t>✓ 287 测试，typecheck 通过</w:t>
             </w:r>
           </w:p>
         </w:tc>

</xml_diff>

<commit_message>
docs: align the test count with the committed tree
</commit_message>
<xml_diff>
--- a/docs/WeiSQL-项目状态报告.docx
+++ b/docs/WeiSQL-项目状态报告.docx
@@ -40,7 +40,7 @@
           <w:rFonts w:ascii="微软雅黑" w:hAnsi="微软雅黑" w:eastAsia="微软雅黑" w:cs="微软雅黑"/>
           <w:sz w:val="21"/>
         </w:rPr>
-        <w:t>工程原型。Manifest V1 与数据包格式稳定，五个包共 287 个自动化测试，CI 覆盖构建、类型、测试与发布元数据；精确检索、ANN、全文、融合、RAG 与单文件容器均有实现与实测数字。尚未发布 npm 包，也没有任何未经测量的性能承诺。</w:t>
+        <w:t>工程原型。Manifest V1 与数据包格式稳定，五个包共 277 个自动化测试，CI 覆盖构建、类型、测试与发布元数据；精确检索、ANN、全文、融合、RAG 与单文件容器均有实现与实测数字。尚未发布 npm 包，也没有任何未经测量的性能承诺。</w:t>
       </w:r>
     </w:p>
     <w:tbl>
@@ -124,7 +124,7 @@
                 <w:rFonts w:ascii="微软雅黑" w:hAnsi="微软雅黑" w:eastAsia="微软雅黑" w:cs="微软雅黑"/>
                 <w:sz w:val="18"/>
               </w:rPr>
-              <w:t>287 个全绿（SDK 191 / DuckDB 20 / WASM 29 / USearch 13 / CLI 34）</w:t>
+              <w:t>277 个全绿（SDK 191 / DuckDB 20 / WASM 19 / USearch 13 / CLI 34）</w:t>
             </w:r>
           </w:p>
         </w:tc>
@@ -2323,7 +2323,7 @@
                 <w:rFonts w:ascii="微软雅黑" w:hAnsi="微软雅黑" w:eastAsia="微软雅黑" w:cs="微软雅黑"/>
                 <w:sz w:val="18"/>
               </w:rPr>
-              <w:t>29</w:t>
+              <w:t>19</w:t>
             </w:r>
           </w:p>
         </w:tc>
@@ -2464,7 +2464,7 @@
                 <w:rFonts w:ascii="微软雅黑" w:hAnsi="微软雅黑" w:eastAsia="微软雅黑" w:cs="微软雅黑"/>
                 <w:sz w:val="18"/>
               </w:rPr>
-              <w:t>287</w:t>
+              <w:t>277</w:t>
             </w:r>
           </w:p>
         </w:tc>
@@ -4698,7 +4698,7 @@
                 <w:rFonts w:ascii="微软雅黑" w:hAnsi="微软雅黑" w:eastAsia="微软雅黑" w:cs="微软雅黑"/>
                 <w:sz w:val="18"/>
               </w:rPr>
-              <w:t>✓ 287 测试，typecheck 通过</w:t>
+              <w:t>✓ 277 测试，typecheck 通过</w:t>
             </w:r>
           </w:p>
         </w:tc>

</xml_diff>

<commit_message>
feat: enhance benchmarking and testing for DuckDB-Wasm adapter, including new materialization tests and resource coverage validation
</commit_message>
<xml_diff>
--- a/docs/WeiSQL-项目状态报告.docx
+++ b/docs/WeiSQL-项目状态报告.docx
@@ -40,7 +40,7 @@
           <w:rFonts w:ascii="微软雅黑" w:hAnsi="微软雅黑" w:eastAsia="微软雅黑" w:cs="微软雅黑"/>
           <w:sz w:val="21"/>
         </w:rPr>
-        <w:t>工程原型。Manifest V1 与数据包格式稳定，五个包共 277 个自动化测试，CI 覆盖构建、类型、测试与发布元数据；精确检索、ANN、全文、融合、RAG 与单文件容器均有实现与实测数字。尚未发布 npm 包，也没有任何未经测量的性能承诺。</w:t>
+        <w:t>工程原型。Manifest V1 与数据包格式稳定，五个包共 279 个自动化测试，CI 覆盖构建、类型、测试与发布元数据；精确检索、ANN、全文、融合、RAG 与单文件容器均有实现与实测数字。尚未发布 npm 包，也没有任何未经测量的性能承诺。</w:t>
       </w:r>
     </w:p>
     <w:tbl>
@@ -124,7 +124,7 @@
                 <w:rFonts w:ascii="微软雅黑" w:hAnsi="微软雅黑" w:eastAsia="微软雅黑" w:cs="微软雅黑"/>
                 <w:sz w:val="18"/>
               </w:rPr>
-              <w:t>277 个全绿（SDK 191 / DuckDB 20 / WASM 19 / USearch 13 / CLI 34）</w:t>
+              <w:t>279 个全绿（SDK 193 / DuckDB 20 / WASM 19 / USearch 13 / CLI 34）</w:t>
             </w:r>
           </w:p>
         </w:tc>
@@ -2229,7 +2229,7 @@
                 <w:rFonts w:ascii="微软雅黑" w:hAnsi="微软雅黑" w:eastAsia="微软雅黑" w:cs="微软雅黑"/>
                 <w:sz w:val="18"/>
               </w:rPr>
-              <w:t>191</w:t>
+              <w:t>193</w:t>
             </w:r>
           </w:p>
         </w:tc>
@@ -2464,7 +2464,7 @@
                 <w:rFonts w:ascii="微软雅黑" w:hAnsi="微软雅黑" w:eastAsia="微软雅黑" w:cs="微软雅黑"/>
                 <w:sz w:val="18"/>
               </w:rPr>
-              <w:t>277</w:t>
+              <w:t>279</w:t>
             </w:r>
           </w:p>
         </w:tc>
@@ -4698,7 +4698,7 @@
                 <w:rFonts w:ascii="微软雅黑" w:hAnsi="微软雅黑" w:eastAsia="微软雅黑" w:cs="微软雅黑"/>
                 <w:sz w:val="18"/>
               </w:rPr>
-              <w:t>✓ 277 测试，typecheck 通过</w:t>
+              <w:t>✓ 279 测试，typecheck 通过</w:t>
             </w:r>
           </w:p>
         </w:tc>

</xml_diff>

<commit_message>
docs: refresh the test count after the wasm adapter landed
</commit_message>
<xml_diff>
--- a/docs/WeiSQL-项目状态报告.docx
+++ b/docs/WeiSQL-项目状态报告.docx
@@ -40,7 +40,7 @@
           <w:rFonts w:ascii="微软雅黑" w:hAnsi="微软雅黑" w:eastAsia="微软雅黑" w:cs="微软雅黑"/>
           <w:sz w:val="21"/>
         </w:rPr>
-        <w:t>工程原型。Manifest V1 与数据包格式稳定，五个包共 279 个自动化测试，CI 覆盖构建、类型、测试与发布元数据；精确检索、ANN、全文、融合、RAG 与单文件容器均有实现与实测数字。尚未发布 npm 包，也没有任何未经测量的性能承诺。</w:t>
+        <w:t>工程原型。Manifest V1 与数据包格式稳定，五个包共 289 个自动化测试，CI 覆盖构建、类型、测试与发布元数据；精确检索、ANN、全文、融合、RAG 与单文件容器均有实现与实测数字。尚未发布 npm 包，也没有任何未经测量的性能承诺。</w:t>
       </w:r>
     </w:p>
     <w:tbl>
@@ -124,7 +124,7 @@
                 <w:rFonts w:ascii="微软雅黑" w:hAnsi="微软雅黑" w:eastAsia="微软雅黑" w:cs="微软雅黑"/>
                 <w:sz w:val="18"/>
               </w:rPr>
-              <w:t>279 个全绿（SDK 193 / DuckDB 20 / WASM 19 / USearch 13 / CLI 34）</w:t>
+              <w:t>289 个全绿（SDK 193 / DuckDB 20 / WASM 29 / USearch 13 / CLI 34）</w:t>
             </w:r>
           </w:p>
         </w:tc>
@@ -2323,7 +2323,7 @@
                 <w:rFonts w:ascii="微软雅黑" w:hAnsi="微软雅黑" w:eastAsia="微软雅黑" w:cs="微软雅黑"/>
                 <w:sz w:val="18"/>
               </w:rPr>
-              <w:t>19</w:t>
+              <w:t>29</w:t>
             </w:r>
           </w:p>
         </w:tc>
@@ -2464,7 +2464,7 @@
                 <w:rFonts w:ascii="微软雅黑" w:hAnsi="微软雅黑" w:eastAsia="微软雅黑" w:cs="微软雅黑"/>
                 <w:sz w:val="18"/>
               </w:rPr>
-              <w:t>279</w:t>
+              <w:t>289</w:t>
             </w:r>
           </w:p>
         </w:tc>
@@ -4698,7 +4698,7 @@
                 <w:rFonts w:ascii="微软雅黑" w:hAnsi="微软雅黑" w:eastAsia="微软雅黑" w:cs="微软雅黑"/>
                 <w:sz w:val="18"/>
               </w:rPr>
-              <w:t>✓ 279 测试，typecheck 通过</w:t>
+              <w:t>✓ 289 测试，typecheck 通过</w:t>
             </w:r>
           </w:p>
         </w:tc>

</xml_diff>

<commit_message>
feat: support co-signing and key rotation for Manifest signatures
</commit_message>
<xml_diff>
--- a/docs/WeiSQL-项目状态报告.docx
+++ b/docs/WeiSQL-项目状态报告.docx
@@ -40,7 +40,7 @@
           <w:rFonts w:ascii="微软雅黑" w:hAnsi="微软雅黑" w:eastAsia="微软雅黑" w:cs="微软雅黑"/>
           <w:sz w:val="21"/>
         </w:rPr>
-        <w:t>工程原型。Manifest V1 与数据包格式稳定，五个包共 289 个自动化测试，CI 覆盖构建、类型、测试与发布元数据；精确检索、ANN、全文、融合、RAG 与单文件容器均有实现与实测数字。尚未发布 npm 包，也没有任何未经测量的性能承诺。</w:t>
+        <w:t>工程原型。Manifest V1 与数据包格式稳定，五个包共 284 个自动化测试，CI 覆盖构建、类型、测试与发布元数据；精确检索、ANN、全文、融合、RAG 与单文件容器均有实现与实测数字。尚未发布 npm 包，也没有任何未经测量的性能承诺。</w:t>
       </w:r>
     </w:p>
     <w:tbl>
@@ -124,7 +124,7 @@
                 <w:rFonts w:ascii="微软雅黑" w:hAnsi="微软雅黑" w:eastAsia="微软雅黑" w:cs="微软雅黑"/>
                 <w:sz w:val="18"/>
               </w:rPr>
-              <w:t>289 个全绿（SDK 193 / DuckDB 20 / WASM 29 / USearch 13 / CLI 34）</w:t>
+              <w:t>284 个全绿（SDK 197 / DuckDB 20 / WASM 19 / USearch 13 / CLI 35）</w:t>
             </w:r>
           </w:p>
         </w:tc>
@@ -1544,7 +1544,7 @@
                 <w:rFonts w:ascii="微软雅黑" w:hAnsi="微软雅黑" w:eastAsia="微软雅黑" w:cs="微软雅黑"/>
                 <w:sz w:val="18"/>
               </w:rPr>
-              <w:t>Manifest Ed25519 签名</w:t>
+              <w:t>Manifest Ed25519 签名（含多签与轮换）</w:t>
             </w:r>
           </w:p>
         </w:tc>
@@ -2229,7 +2229,7 @@
                 <w:rFonts w:ascii="微软雅黑" w:hAnsi="微软雅黑" w:eastAsia="微软雅黑" w:cs="微软雅黑"/>
                 <w:sz w:val="18"/>
               </w:rPr>
-              <w:t>193</w:t>
+              <w:t>197</w:t>
             </w:r>
           </w:p>
         </w:tc>
@@ -2417,7 +2417,7 @@
                 <w:rFonts w:ascii="微软雅黑" w:hAnsi="微软雅黑" w:eastAsia="微软雅黑" w:cs="微软雅黑"/>
                 <w:sz w:val="18"/>
               </w:rPr>
-              <w:t>34</w:t>
+              <w:t>35</w:t>
             </w:r>
           </w:p>
         </w:tc>
@@ -2464,7 +2464,7 @@
                 <w:rFonts w:ascii="微软雅黑" w:hAnsi="微软雅黑" w:eastAsia="微软雅黑" w:cs="微软雅黑"/>
                 <w:sz w:val="18"/>
               </w:rPr>
-              <w:t>289</w:t>
+              <w:t>284</w:t>
             </w:r>
           </w:p>
         </w:tc>
@@ -4698,7 +4698,7 @@
                 <w:rFonts w:ascii="微软雅黑" w:hAnsi="微软雅黑" w:eastAsia="微软雅黑" w:cs="微软雅黑"/>
                 <w:sz w:val="18"/>
               </w:rPr>
-              <w:t>✓ 289 测试，typecheck 通过</w:t>
+              <w:t>✓ 284 测试，typecheck 通过</w:t>
             </w:r>
           </w:p>
         </w:tc>

</xml_diff>

<commit_message>
docs: refresh the count for the wasm adapter build
</commit_message>
<xml_diff>
--- a/docs/WeiSQL-项目状态报告.docx
+++ b/docs/WeiSQL-项目状态报告.docx
@@ -40,7 +40,7 @@
           <w:rFonts w:ascii="微软雅黑" w:hAnsi="微软雅黑" w:eastAsia="微软雅黑" w:cs="微软雅黑"/>
           <w:sz w:val="21"/>
         </w:rPr>
-        <w:t>工程原型。Manifest V1 与数据包格式稳定，五个包共 284 个自动化测试，CI 覆盖构建、类型、测试与发布元数据；精确检索、ANN、全文、融合、RAG 与单文件容器均有实现与实测数字。尚未发布 npm 包，也没有任何未经测量的性能承诺。</w:t>
+        <w:t>工程原型。Manifest V1 与数据包格式稳定，五个包共 294 个自动化测试，CI 覆盖构建、类型、测试与发布元数据；精确检索、ANN、全文、融合、RAG 与单文件容器均有实现与实测数字。尚未发布 npm 包，也没有任何未经测量的性能承诺。</w:t>
       </w:r>
     </w:p>
     <w:tbl>
@@ -124,7 +124,7 @@
                 <w:rFonts w:ascii="微软雅黑" w:hAnsi="微软雅黑" w:eastAsia="微软雅黑" w:cs="微软雅黑"/>
                 <w:sz w:val="18"/>
               </w:rPr>
-              <w:t>284 个全绿（SDK 197 / DuckDB 20 / WASM 19 / USearch 13 / CLI 35）</w:t>
+              <w:t>294 个全绿（SDK 197 / DuckDB 20 / WASM 29 / USearch 13 / CLI 35）</w:t>
             </w:r>
           </w:p>
         </w:tc>
@@ -2464,7 +2464,7 @@
                 <w:rFonts w:ascii="微软雅黑" w:hAnsi="微软雅黑" w:eastAsia="微软雅黑" w:cs="微软雅黑"/>
                 <w:sz w:val="18"/>
               </w:rPr>
-              <w:t>284</w:t>
+              <w:t>294</w:t>
             </w:r>
           </w:p>
         </w:tc>
@@ -4698,7 +4698,7 @@
                 <w:rFonts w:ascii="微软雅黑" w:hAnsi="微软雅黑" w:eastAsia="微软雅黑" w:cs="微软雅黑"/>
                 <w:sz w:val="18"/>
               </w:rPr>
-              <w:t>✓ 284 测试，typecheck 通过</w:t>
+              <w:t>✓ 294 测试，typecheck 通过</w:t>
             </w:r>
           </w:p>
         </w:tc>

</xml_diff>

<commit_message>
feat: cut RAG evidence at sentence or word boundaries
</commit_message>
<xml_diff>
--- a/docs/WeiSQL-项目状态报告.docx
+++ b/docs/WeiSQL-项目状态报告.docx
@@ -40,7 +40,7 @@
           <w:rFonts w:ascii="微软雅黑" w:hAnsi="微软雅黑" w:eastAsia="微软雅黑" w:cs="微软雅黑"/>
           <w:sz w:val="21"/>
         </w:rPr>
-        <w:t>工程原型。Manifest V1 与数据包格式稳定，五个包共 294 个自动化测试，CI 覆盖构建、类型、测试与发布元数据；精确检索、ANN、全文、融合、RAG 与单文件容器均有实现与实测数字。尚未发布 npm 包，也没有任何未经测量的性能承诺。</w:t>
+        <w:t>工程原型。Manifest V1 与数据包格式稳定，五个包共 300 个自动化测试，CI 覆盖构建、类型、测试与发布元数据；精确检索、ANN、全文、融合、RAG 与单文件容器均有实现与实测数字。尚未发布 npm 包，也没有任何未经测量的性能承诺。</w:t>
       </w:r>
     </w:p>
     <w:tbl>
@@ -124,7 +124,7 @@
                 <w:rFonts w:ascii="微软雅黑" w:hAnsi="微软雅黑" w:eastAsia="微软雅黑" w:cs="微软雅黑"/>
                 <w:sz w:val="18"/>
               </w:rPr>
-              <w:t>294 个全绿（SDK 197 / DuckDB 20 / WASM 29 / USearch 13 / CLI 35）</w:t>
+              <w:t>300 个全绿（SDK 203 / DuckDB 20 / WASM 29 / USearch 13 / CLI 35）</w:t>
             </w:r>
           </w:p>
         </w:tc>
@@ -2229,7 +2229,7 @@
                 <w:rFonts w:ascii="微软雅黑" w:hAnsi="微软雅黑" w:eastAsia="微软雅黑" w:cs="微软雅黑"/>
                 <w:sz w:val="18"/>
               </w:rPr>
-              <w:t>197</w:t>
+              <w:t>203</w:t>
             </w:r>
           </w:p>
         </w:tc>
@@ -2464,7 +2464,7 @@
                 <w:rFonts w:ascii="微软雅黑" w:hAnsi="微软雅黑" w:eastAsia="微软雅黑" w:cs="微软雅黑"/>
                 <w:sz w:val="18"/>
               </w:rPr>
-              <w:t>294</w:t>
+              <w:t>300</w:t>
             </w:r>
           </w:p>
         </w:tc>
@@ -4698,7 +4698,7 @@
                 <w:rFonts w:ascii="微软雅黑" w:hAnsi="微软雅黑" w:eastAsia="微软雅黑" w:cs="微软雅黑"/>
                 <w:sz w:val="18"/>
               </w:rPr>
-              <w:t>✓ 294 测试，typecheck 通过</w:t>
+              <w:t>✓ 300 测试，typecheck 通过</w:t>
             </w:r>
           </w:p>
         </w:tc>

</xml_diff>

<commit_message>
feat: enforce a minimum number of pinned signers
</commit_message>
<xml_diff>
--- a/docs/WeiSQL-项目状态报告.docx
+++ b/docs/WeiSQL-项目状态报告.docx
@@ -40,7 +40,7 @@
           <w:rFonts w:ascii="微软雅黑" w:hAnsi="微软雅黑" w:eastAsia="微软雅黑" w:cs="微软雅黑"/>
           <w:sz w:val="21"/>
         </w:rPr>
-        <w:t>工程原型。Manifest V1 与数据包格式稳定，五个包共 300 个自动化测试，CI 覆盖构建、类型、测试与发布元数据；精确检索、ANN、全文、融合、RAG 与单文件容器均有实现与实测数字。尚未发布 npm 包，也没有任何未经测量的性能承诺。</w:t>
+        <w:t>工程原型。Manifest V1 与数据包格式稳定，五个包共 302 个自动化测试，CI 覆盖构建、类型、测试与发布元数据；精确检索、ANN、全文、融合、RAG 与单文件容器均有实现与实测数字。尚未发布 npm 包，也没有任何未经测量的性能承诺。</w:t>
       </w:r>
     </w:p>
     <w:tbl>
@@ -124,7 +124,7 @@
                 <w:rFonts w:ascii="微软雅黑" w:hAnsi="微软雅黑" w:eastAsia="微软雅黑" w:cs="微软雅黑"/>
                 <w:sz w:val="18"/>
               </w:rPr>
-              <w:t>300 个全绿（SDK 203 / DuckDB 20 / WASM 29 / USearch 13 / CLI 35）</w:t>
+              <w:t>302 个全绿（SDK 204 / DuckDB 20 / WASM 29 / USearch 13 / CLI 36）</w:t>
             </w:r>
           </w:p>
         </w:tc>
@@ -2229,7 +2229,7 @@
                 <w:rFonts w:ascii="微软雅黑" w:hAnsi="微软雅黑" w:eastAsia="微软雅黑" w:cs="微软雅黑"/>
                 <w:sz w:val="18"/>
               </w:rPr>
-              <w:t>203</w:t>
+              <w:t>204</w:t>
             </w:r>
           </w:p>
         </w:tc>
@@ -2417,7 +2417,7 @@
                 <w:rFonts w:ascii="微软雅黑" w:hAnsi="微软雅黑" w:eastAsia="微软雅黑" w:cs="微软雅黑"/>
                 <w:sz w:val="18"/>
               </w:rPr>
-              <w:t>35</w:t>
+              <w:t>36</w:t>
             </w:r>
           </w:p>
         </w:tc>
@@ -2464,7 +2464,7 @@
                 <w:rFonts w:ascii="微软雅黑" w:hAnsi="微软雅黑" w:eastAsia="微软雅黑" w:cs="微软雅黑"/>
                 <w:sz w:val="18"/>
               </w:rPr>
-              <w:t>300</w:t>
+              <w:t>302</w:t>
             </w:r>
           </w:p>
         </w:tc>
@@ -4698,7 +4698,7 @@
                 <w:rFonts w:ascii="微软雅黑" w:hAnsi="微软雅黑" w:eastAsia="微软雅黑" w:cs="微软雅黑"/>
                 <w:sz w:val="18"/>
               </w:rPr>
-              <w:t>✓ 300 测试，typecheck 通过</w:t>
+              <w:t>✓ 302 测试，typecheck 通过</w:t>
             </w:r>
           </w:p>
         </w:tc>

</xml_diff>

<commit_message>
feat: root-key authorization for release signing keys
</commit_message>
<xml_diff>
--- a/docs/WeiSQL-项目状态报告.docx
+++ b/docs/WeiSQL-项目状态报告.docx
@@ -40,7 +40,7 @@
           <w:rFonts w:ascii="微软雅黑" w:hAnsi="微软雅黑" w:eastAsia="微软雅黑" w:cs="微软雅黑"/>
           <w:sz w:val="21"/>
         </w:rPr>
-        <w:t>工程原型。Manifest V1 与数据包格式稳定，五个包共 302 个自动化测试，CI 覆盖构建、类型、测试与发布元数据；精确检索、ANN、全文、融合、RAG 与单文件容器均有实现与实测数字。尚未发布 npm 包，也没有任何未经测量的性能承诺。</w:t>
+        <w:t>工程原型。Manifest V1 与数据包格式稳定，五个包共 305 个自动化测试，CI 覆盖构建、类型、测试与发布元数据；精确检索、ANN、全文、融合、RAG 与单文件容器均有实现与实测数字。尚未发布 npm 包，也没有任何未经测量的性能承诺。</w:t>
       </w:r>
     </w:p>
     <w:tbl>
@@ -124,7 +124,7 @@
                 <w:rFonts w:ascii="微软雅黑" w:hAnsi="微软雅黑" w:eastAsia="微软雅黑" w:cs="微软雅黑"/>
                 <w:sz w:val="18"/>
               </w:rPr>
-              <w:t>302 个全绿（SDK 204 / DuckDB 20 / WASM 29 / USearch 13 / CLI 36）</w:t>
+              <w:t>305 个全绿（SDK 207 / DuckDB 20 / WASM 29 / USearch 13 / CLI 36）</w:t>
             </w:r>
           </w:p>
         </w:tc>
@@ -1544,7 +1544,7 @@
                 <w:rFonts w:ascii="微软雅黑" w:hAnsi="微软雅黑" w:eastAsia="微软雅黑" w:cs="微软雅黑"/>
                 <w:sz w:val="18"/>
               </w:rPr>
-              <w:t>Manifest Ed25519 签名（含多签与轮换）</w:t>
+              <w:t>Manifest Ed25519 签名（多签 / 轮换 / root 授权）</w:t>
             </w:r>
           </w:p>
         </w:tc>
@@ -1604,7 +1604,7 @@
                 <w:rFonts w:ascii="微软雅黑" w:hAnsi="微软雅黑" w:eastAsia="微软雅黑" w:cs="微软雅黑"/>
                 <w:sz w:val="18"/>
               </w:rPr>
-              <w:t>篡改与信任固定均拒绝</w:t>
+              <w:t>篡改、信任固定与有效期均拒绝</w:t>
             </w:r>
           </w:p>
         </w:tc>
@@ -2229,7 +2229,7 @@
                 <w:rFonts w:ascii="微软雅黑" w:hAnsi="微软雅黑" w:eastAsia="微软雅黑" w:cs="微软雅黑"/>
                 <w:sz w:val="18"/>
               </w:rPr>
-              <w:t>204</w:t>
+              <w:t>207</w:t>
             </w:r>
           </w:p>
         </w:tc>
@@ -2464,7 +2464,7 @@
                 <w:rFonts w:ascii="微软雅黑" w:hAnsi="微软雅黑" w:eastAsia="微软雅黑" w:cs="微软雅黑"/>
                 <w:sz w:val="18"/>
               </w:rPr>
-              <w:t>302</w:t>
+              <w:t>305</w:t>
             </w:r>
           </w:p>
         </w:tc>
@@ -4698,7 +4698,7 @@
                 <w:rFonts w:ascii="微软雅黑" w:hAnsi="微软雅黑" w:eastAsia="微软雅黑" w:cs="微软雅黑"/>
                 <w:sz w:val="18"/>
               </w:rPr>
-              <w:t>✓ 302 测试，typecheck 通过</w:t>
+              <w:t>✓ 305 测试，typecheck 通过</w:t>
             </w:r>
           </w:p>
         </w:tc>

</xml_diff>

<commit_message>
feat: add CLI authorize for root-key delegations
</commit_message>
<xml_diff>
--- a/docs/WeiSQL-项目状态报告.docx
+++ b/docs/WeiSQL-项目状态报告.docx
@@ -40,7 +40,7 @@
           <w:rFonts w:ascii="微软雅黑" w:hAnsi="微软雅黑" w:eastAsia="微软雅黑" w:cs="微软雅黑"/>
           <w:sz w:val="21"/>
         </w:rPr>
-        <w:t>工程原型。Manifest V1 与数据包格式稳定，五个包共 305 个自动化测试，CI 覆盖构建、类型、测试与发布元数据；精确检索、ANN、全文、融合、RAG 与单文件容器均有实现与实测数字。尚未发布 npm 包，也没有任何未经测量的性能承诺。</w:t>
+        <w:t>工程原型。Manifest V1 与数据包格式稳定，五个包共 307 个自动化测试，CI 覆盖构建、类型、测试与发布元数据；精确检索、ANN、全文、融合、RAG 与单文件容器均有实现与实测数字。尚未发布 npm 包，也没有任何未经测量的性能承诺。</w:t>
       </w:r>
     </w:p>
     <w:tbl>
@@ -124,7 +124,7 @@
                 <w:rFonts w:ascii="微软雅黑" w:hAnsi="微软雅黑" w:eastAsia="微软雅黑" w:cs="微软雅黑"/>
                 <w:sz w:val="18"/>
               </w:rPr>
-              <w:t>305 个全绿（SDK 207 / DuckDB 20 / WASM 29 / USearch 13 / CLI 36）</w:t>
+              <w:t>307 个全绿（SDK 207 / DuckDB 20 / WASM 29 / USearch 13 / CLI 38）</w:t>
             </w:r>
           </w:p>
         </w:tc>
@@ -2417,7 +2417,7 @@
                 <w:rFonts w:ascii="微软雅黑" w:hAnsi="微软雅黑" w:eastAsia="微软雅黑" w:cs="微软雅黑"/>
                 <w:sz w:val="18"/>
               </w:rPr>
-              <w:t>36</w:t>
+              <w:t>38</w:t>
             </w:r>
           </w:p>
         </w:tc>
@@ -2464,7 +2464,7 @@
                 <w:rFonts w:ascii="微软雅黑" w:hAnsi="微软雅黑" w:eastAsia="微软雅黑" w:cs="微软雅黑"/>
                 <w:sz w:val="18"/>
               </w:rPr>
-              <w:t>305</w:t>
+              <w:t>307</w:t>
             </w:r>
           </w:p>
         </w:tc>
@@ -4698,7 +4698,7 @@
                 <w:rFonts w:ascii="微软雅黑" w:hAnsi="微软雅黑" w:eastAsia="微软雅黑" w:cs="微软雅黑"/>
                 <w:sz w:val="18"/>
               </w:rPr>
-              <w:t>✓ 305 测试，typecheck 通过</w:t>
+              <w:t>✓ 307 测试，typecheck 通过</w:t>
             </w:r>
           </w:p>
         </w:tc>

</xml_diff>

<commit_message>
bench: measure quantization recall and index size
</commit_message>
<xml_diff>
--- a/docs/WeiSQL-项目状态报告.docx
+++ b/docs/WeiSQL-项目状态报告.docx
@@ -23,7 +23,7 @@
           <w:color w:val="595959"/>
           <w:sz w:val="20"/>
         </w:rPr>
-        <w:t>2026-10-31 · 仓库 HEAD c267b0e · 247 个自动化测试 · 尚未发布 npm</w:t>
+        <w:t>2026-10-31 · 仓库 HEAD 3df8871 · 315 个自动化测试 · 尚未发布 npm</w:t>
       </w:r>
     </w:p>
     <w:p>
@@ -40,7 +40,7 @@
           <w:rFonts w:ascii="微软雅黑" w:hAnsi="微软雅黑" w:eastAsia="微软雅黑" w:cs="微软雅黑"/>
           <w:sz w:val="21"/>
         </w:rPr>
-        <w:t>工程原型。Manifest V1 与数据包格式稳定，五个包共 307 个自动化测试，CI 覆盖构建、类型、测试与发布元数据；精确检索、ANN、全文、融合、RAG 与单文件容器均有实现与实测数字。尚未发布 npm 包，也没有任何未经测量的性能承诺。</w:t>
+        <w:t>工程原型。Manifest V1 与数据包格式稳定，五个包共 315 个自动化测试，CI 覆盖构建、类型、测试与发布元数据；精确检索、ANN、全文、融合、RAG、单文件容器与浏览器 SQL 均有实现与实测数字。尚未发布 npm 包，也没有任何未经测量的性能承诺。</w:t>
       </w:r>
     </w:p>
     <w:tbl>
@@ -124,7 +124,7 @@
                 <w:rFonts w:ascii="微软雅黑" w:hAnsi="微软雅黑" w:eastAsia="微软雅黑" w:cs="微软雅黑"/>
                 <w:sz w:val="18"/>
               </w:rPr>
-              <w:t>307 个全绿（SDK 207 / DuckDB 20 / WASM 29 / USearch 13 / CLI 38）</w:t>
+              <w:t>315 个全绿（SDK 207 / DuckDB 21 / WASM 36 / USearch 13 / CLI 38）</w:t>
             </w:r>
           </w:p>
         </w:tc>
@@ -156,7 +156,7 @@
                 <w:rFonts w:ascii="微软雅黑" w:hAnsi="微软雅黑" w:eastAsia="微软雅黑" w:cs="微软雅黑"/>
                 <w:sz w:val="18"/>
               </w:rPr>
-              <w:t>GitHub Actions：Ubuntu + Windows 行为闸门，另有派生索引与容器作业</w:t>
+              <w:t>GitHub Actions：Ubuntu + Windows 行为闸门，另有派生索引、容器与 bench:wasm 冒烟作业</w:t>
             </w:r>
           </w:p>
         </w:tc>
@@ -252,7 +252,7 @@
                 <w:rFonts w:ascii="微软雅黑" w:hAnsi="微软雅黑" w:eastAsia="微软雅黑" w:cs="微软雅黑"/>
                 <w:sz w:val="18"/>
               </w:rPr>
-              <w:t>精确向量、ANN（含分布对照）、全文（含体积拆分）、浏览器一致性</w:t>
+              <w:t>精确向量、ANN（含分布对照）、全文（含体积拆分）、浏览器一致性、DuckDB-Wasm 物化</w:t>
             </w:r>
           </w:p>
         </w:tc>
@@ -1082,6 +1082,83 @@
                 <w:rFonts w:ascii="微软雅黑" w:hAnsi="微软雅黑" w:eastAsia="微软雅黑" w:cs="微软雅黑"/>
                 <w:sz w:val="18"/>
               </w:rPr>
+              <w:t>DuckDB-Wasm 浏览器 SQL（含只读 CTE）</w:t>
+            </w:r>
+          </w:p>
+        </w:tc>
+        <w:tc>
+          <w:tcPr>
+            <w:tcW w:type="dxa" w:w="964"/>
+          </w:tcPr>
+          <w:p>
+            <w:r/>
+            <w:r>
+              <w:rPr>
+                <w:rFonts w:ascii="微软雅黑" w:hAnsi="微软雅黑" w:eastAsia="微软雅黑" w:cs="微软雅黑"/>
+                <w:sz w:val="18"/>
+              </w:rPr>
+              <w:t>✓</w:t>
+            </w:r>
+          </w:p>
+        </w:tc>
+        <w:tc>
+          <w:tcPr>
+            <w:tcW w:type="dxa" w:w="964"/>
+          </w:tcPr>
+          <w:p>
+            <w:r/>
+            <w:r>
+              <w:rPr>
+                <w:rFonts w:ascii="微软雅黑" w:hAnsi="微软雅黑" w:eastAsia="微软雅黑" w:cs="微软雅黑"/>
+                <w:sz w:val="18"/>
+              </w:rPr>
+              <w:t>✓ + 探针</w:t>
+            </w:r>
+          </w:p>
+        </w:tc>
+        <w:tc>
+          <w:tcPr>
+            <w:tcW w:type="dxa" w:w="964"/>
+          </w:tcPr>
+          <w:p>
+            <w:r/>
+            <w:r>
+              <w:rPr>
+                <w:rFonts w:ascii="微软雅黑" w:hAnsi="微软雅黑" w:eastAsia="微软雅黑" w:cs="微软雅黑"/>
+                <w:sz w:val="18"/>
+              </w:rPr>
+              <w:t>✓</w:t>
+            </w:r>
+          </w:p>
+        </w:tc>
+        <w:tc>
+          <w:tcPr>
+            <w:tcW w:type="dxa" w:w="2438"/>
+          </w:tcPr>
+          <w:p>
+            <w:r/>
+            <w:r>
+              <w:rPr>
+                <w:rFonts w:ascii="微软雅黑" w:hAnsi="微软雅黑" w:eastAsia="微软雅黑" w:cs="微软雅黑"/>
+                <w:sz w:val="18"/>
+              </w:rPr>
+              <w:t>open() 1.37–1.70 s，查询 &lt; 50 ms</w:t>
+            </w:r>
+          </w:p>
+        </w:tc>
+      </w:tr>
+      <w:tr>
+        <w:tc>
+          <w:tcPr>
+            <w:tcW w:type="dxa" w:w="3628"/>
+          </w:tcPr>
+          <w:p>
+            <w:r/>
+            <w:r>
+              <w:rPr>
+                <w:rFonts w:ascii="微软雅黑" w:hAnsi="微软雅黑" w:eastAsia="微软雅黑" w:cs="微软雅黑"/>
+                <w:sz w:val="18"/>
+              </w:rPr>
               <w:t>USearch ANN（持久化 / 现场构建）</w:t>
             </w:r>
           </w:p>
@@ -2012,6 +2089,53 @@
                 <w:sz w:val="18"/>
               </w:rPr>
               <w:t>@duckdb/node-api 2.0.0-r.1</w:t>
+            </w:r>
+          </w:p>
+        </w:tc>
+      </w:tr>
+      <w:tr>
+        <w:tc>
+          <w:tcPr>
+            <w:tcW w:type="dxa" w:w="3061"/>
+          </w:tcPr>
+          <w:p>
+            <w:r/>
+            <w:r>
+              <w:rPr>
+                <w:rFonts w:ascii="微软雅黑" w:hAnsi="微软雅黑" w:eastAsia="微软雅黑" w:cs="微软雅黑"/>
+                <w:sz w:val="18"/>
+              </w:rPr>
+              <w:t>@weisql/duckdb-wasm-adapter</w:t>
+            </w:r>
+          </w:p>
+        </w:tc>
+        <w:tc>
+          <w:tcPr>
+            <w:tcW w:type="dxa" w:w="1247"/>
+          </w:tcPr>
+          <w:p>
+            <w:r/>
+            <w:r>
+              <w:rPr>
+                <w:rFonts w:ascii="微软雅黑" w:hAnsi="微软雅黑" w:eastAsia="微软雅黑" w:cs="微软雅黑"/>
+                <w:sz w:val="18"/>
+              </w:rPr>
+              <w:t>0.1.0</w:t>
+            </w:r>
+          </w:p>
+        </w:tc>
+        <w:tc>
+          <w:tcPr>
+            <w:tcW w:type="dxa" w:w="4649"/>
+          </w:tcPr>
+          <w:p>
+            <w:r/>
+            <w:r>
+              <w:rPr>
+                <w:rFonts w:ascii="微软雅黑" w:hAnsi="微软雅黑" w:eastAsia="微软雅黑" w:cs="微软雅黑"/>
+                <w:sz w:val="18"/>
+              </w:rPr>
+              <w:t>@duckdb/duckdb-wasm 1.32.0</w:t>
             </w:r>
           </w:p>
         </w:tc>
@@ -2276,7 +2400,7 @@
                 <w:rFonts w:ascii="微软雅黑" w:hAnsi="微软雅黑" w:eastAsia="微软雅黑" w:cs="微软雅黑"/>
                 <w:sz w:val="18"/>
               </w:rPr>
-              <w:t>20</w:t>
+              <w:t>21</w:t>
             </w:r>
           </w:p>
         </w:tc>
@@ -2291,7 +2415,7 @@
                 <w:rFonts w:ascii="微软雅黑" w:hAnsi="微软雅黑" w:eastAsia="微软雅黑" w:cs="微软雅黑"/>
                 <w:sz w:val="18"/>
               </w:rPr>
-              <w:t>只读边界、参数绑定、两种表加载、取消</w:t>
+              <w:t>只读边界、参数绑定、两种表加载、两层字节预算、取消</w:t>
             </w:r>
           </w:p>
         </w:tc>
@@ -2323,7 +2447,7 @@
                 <w:rFonts w:ascii="微软雅黑" w:hAnsi="微软雅黑" w:eastAsia="微软雅黑" w:cs="微软雅黑"/>
                 <w:sz w:val="18"/>
               </w:rPr>
-              <w:t>29</w:t>
+              <w:t>36</w:t>
             </w:r>
           </w:p>
         </w:tc>
@@ -2338,7 +2462,7 @@
                 <w:rFonts w:ascii="微软雅黑" w:hAnsi="微软雅黑" w:eastAsia="微软雅黑" w:cs="微软雅黑"/>
                 <w:sz w:val="18"/>
               </w:rPr>
-              <w:t>关键字白名单、参数类型收窄、真实 WASM 引擎集成</w:t>
+              <w:t>关键字白名单、CTE 分类、值映射、两层预算、取消、错误契约、真实 WASM 集成</w:t>
             </w:r>
           </w:p>
         </w:tc>
@@ -2464,7 +2588,7 @@
                 <w:rFonts w:ascii="微软雅黑" w:hAnsi="微软雅黑" w:eastAsia="微软雅黑" w:cs="微软雅黑"/>
                 <w:sz w:val="18"/>
               </w:rPr>
-              <w:t>307</w:t>
+              <w:t>315</w:t>
             </w:r>
           </w:p>
         </w:tc>
@@ -2505,7 +2629,7 @@
           <w:rFonts w:ascii="微软雅黑" w:hAnsi="微软雅黑" w:eastAsia="微软雅黑" w:cs="微软雅黑"/>
           <w:sz w:val="21"/>
         </w:rPr>
-        <w:t>derived 作业：fixture 可复现性（重生成后 git status 必须为空）→ 构建文本/ANN 索引并校验 → 打包容器 → 解包后再次校验。</w:t>
+        <w:t>derived 作业：fixture 可复现性（重生成后 git status 必须为空）→ 构建文本/ANN 索引并校验 → 打包容器 → 解包后再次校验 → bench:wasm 冒烟（1k 行物化）。</w:t>
       </w:r>
     </w:p>
     <w:p>
@@ -2517,7 +2641,7 @@
           <w:rFonts w:ascii="微软雅黑" w:hAnsi="微软雅黑" w:eastAsia="微软雅黑" w:cs="微软雅黑"/>
           <w:sz w:val="21"/>
         </w:rPr>
-        <w:t>probe:* 与 bench 不在 CI 内：需要 Chromium / Python / 稳定机器，因此浏览器与性能结论必须在本地复现并注明环境。</w:t>
+        <w:t>probe:* 与完整 bench 不在 CI 内：需要 Chromium / Python / 稳定机器，因此浏览器与性能结论必须在本地复现并注明环境。</w:t>
       </w:r>
     </w:p>
     <w:p>
@@ -3004,7 +3128,7 @@
                 <w:rFonts w:ascii="微软雅黑" w:hAnsi="微软雅黑" w:eastAsia="微软雅黑" w:cs="微软雅黑"/>
                 <w:sz w:val="18"/>
               </w:rPr>
-              <w:t>全文索引体积</w:t>
+              <w:t>量化（合成）</w:t>
             </w:r>
           </w:p>
         </w:tc>
@@ -3019,7 +3143,7 @@
                 <w:rFonts w:ascii="微软雅黑" w:hAnsi="微软雅黑" w:eastAsia="微软雅黑" w:cs="微软雅黑"/>
                 <w:sz w:val="18"/>
               </w:rPr>
-              <w:t>74.2 MB</w:t>
+              <w:t>f16 −39% / i8 −58% 体积</w:t>
             </w:r>
           </w:p>
         </w:tc>
@@ -3034,7 +3158,7 @@
                 <w:rFonts w:ascii="微软雅黑" w:hAnsi="微软雅黑" w:eastAsia="微软雅黑" w:cs="微软雅黑"/>
                 <w:sz w:val="18"/>
               </w:rPr>
-              <w:t>100k 文档、5000 词项、50 tokens/文档</w:t>
+              <w:t>50k × 128，均匀随机</w:t>
             </w:r>
           </w:p>
         </w:tc>
@@ -3049,7 +3173,7 @@
                 <w:rFonts w:ascii="微软雅黑" w:hAnsi="微软雅黑" w:eastAsia="微软雅黑" w:cs="微软雅黑"/>
                 <w:sz w:val="18"/>
               </w:rPr>
-              <w:t>其中正文 33.1 MB</w:t>
+              <w:t>召回 0.805 → 0.76 / 0.70；真实语料未测</w:t>
             </w:r>
           </w:p>
         </w:tc>
@@ -3066,7 +3190,7 @@
                 <w:rFonts w:ascii="微软雅黑" w:hAnsi="微软雅黑" w:eastAsia="微软雅黑" w:cs="微软雅黑"/>
                 <w:sz w:val="18"/>
               </w:rPr>
-              <w:t>全文查询 p50</w:t>
+              <w:t>全文索引体积</w:t>
             </w:r>
           </w:p>
         </w:tc>
@@ -3081,7 +3205,7 @@
                 <w:rFonts w:ascii="微软雅黑" w:hAnsi="微软雅黑" w:eastAsia="微软雅黑" w:cs="微软雅黑"/>
                 <w:sz w:val="18"/>
               </w:rPr>
-              <w:t>10.2–10.8 ms</w:t>
+              <w:t>74.2 MB</w:t>
             </w:r>
           </w:p>
         </w:tc>
@@ -3096,7 +3220,7 @@
                 <w:rFonts w:ascii="微软雅黑" w:hAnsi="微软雅黑" w:eastAsia="微软雅黑" w:cs="微软雅黑"/>
                 <w:sz w:val="18"/>
               </w:rPr>
-              <w:t>同上</w:t>
+              <w:t>100k 文档、5000 词项、50 tokens/文档</w:t>
             </w:r>
           </w:p>
         </w:tc>
@@ -3111,7 +3235,7 @@
                 <w:rFonts w:ascii="微软雅黑" w:hAnsi="微软雅黑" w:eastAsia="微软雅黑" w:cs="微软雅黑"/>
                 <w:sz w:val="18"/>
               </w:rPr>
-              <w:t>固定开销 ≈8 ms + 每命中随机读</w:t>
+              <w:t>其中正文 33.1 MB</w:t>
             </w:r>
           </w:p>
         </w:tc>
@@ -3128,7 +3252,7 @@
                 <w:rFonts w:ascii="微软雅黑" w:hAnsi="微软雅黑" w:eastAsia="微软雅黑" w:cs="微软雅黑"/>
                 <w:sz w:val="18"/>
               </w:rPr>
-              <w:t>全文索引构建</w:t>
+              <w:t>全文查询 p50</w:t>
             </w:r>
           </w:p>
         </w:tc>
@@ -3143,7 +3267,7 @@
                 <w:rFonts w:ascii="微软雅黑" w:hAnsi="微软雅黑" w:eastAsia="微软雅黑" w:cs="微软雅黑"/>
                 <w:sz w:val="18"/>
               </w:rPr>
-              <w:t>4.5 s</w:t>
+              <w:t>10.2–10.8 ms</w:t>
             </w:r>
           </w:p>
         </w:tc>
@@ -3173,7 +3297,7 @@
                 <w:rFonts w:ascii="微软雅黑" w:hAnsi="微软雅黑" w:eastAsia="微软雅黑" w:cs="微软雅黑"/>
                 <w:sz w:val="18"/>
               </w:rPr>
-              <w:t>含读取 Parquet 文本列</w:t>
+              <w:t>固定开销 ≈8 ms + 每命中随机读</w:t>
             </w:r>
           </w:p>
         </w:tc>
@@ -3190,6 +3314,68 @@
                 <w:rFonts w:ascii="微软雅黑" w:hAnsi="微软雅黑" w:eastAsia="微软雅黑" w:cs="微软雅黑"/>
                 <w:sz w:val="18"/>
               </w:rPr>
+              <w:t>全文索引构建</w:t>
+            </w:r>
+          </w:p>
+        </w:tc>
+        <w:tc>
+          <w:tcPr>
+            <w:tcW w:type="dxa" w:w="2154"/>
+          </w:tcPr>
+          <w:p>
+            <w:r/>
+            <w:r>
+              <w:rPr>
+                <w:rFonts w:ascii="微软雅黑" w:hAnsi="微软雅黑" w:eastAsia="微软雅黑" w:cs="微软雅黑"/>
+                <w:sz w:val="18"/>
+              </w:rPr>
+              <w:t>4.5 s</w:t>
+            </w:r>
+          </w:p>
+        </w:tc>
+        <w:tc>
+          <w:tcPr>
+            <w:tcW w:type="dxa" w:w="3061"/>
+          </w:tcPr>
+          <w:p>
+            <w:r/>
+            <w:r>
+              <w:rPr>
+                <w:rFonts w:ascii="微软雅黑" w:hAnsi="微软雅黑" w:eastAsia="微软雅黑" w:cs="微软雅黑"/>
+                <w:sz w:val="18"/>
+              </w:rPr>
+              <w:t>同上</w:t>
+            </w:r>
+          </w:p>
+        </w:tc>
+        <w:tc>
+          <w:tcPr>
+            <w:tcW w:type="dxa" w:w="1701"/>
+          </w:tcPr>
+          <w:p>
+            <w:r/>
+            <w:r>
+              <w:rPr>
+                <w:rFonts w:ascii="微软雅黑" w:hAnsi="微软雅黑" w:eastAsia="微软雅黑" w:cs="微软雅黑"/>
+                <w:sz w:val="18"/>
+              </w:rPr>
+              <w:t>含读取 Parquet 文本列</w:t>
+            </w:r>
+          </w:p>
+        </w:tc>
+      </w:tr>
+      <w:tr>
+        <w:tc>
+          <w:tcPr>
+            <w:tcW w:type="dxa" w:w="2041"/>
+          </w:tcPr>
+          <w:p>
+            <w:r/>
+            <w:r>
+              <w:rPr>
+                <w:rFonts w:ascii="微软雅黑" w:hAnsi="微软雅黑" w:eastAsia="微软雅黑" w:cs="微软雅黑"/>
+                <w:sz w:val="18"/>
+              </w:rPr>
               <w:t>浏览器一致性</w:t>
             </w:r>
           </w:p>
@@ -3205,7 +3391,7 @@
                 <w:rFonts w:ascii="微软雅黑" w:hAnsi="微软雅黑" w:eastAsia="微软雅黑" w:cs="微软雅黑"/>
                 <w:sz w:val="18"/>
               </w:rPr>
-              <w:t>8 向量 + 5 文本 + RAG + 容器</w:t>
+              <w:t>8 向量 + 5 文本 + 9 SQL + RAG + 容器</w:t>
             </w:r>
           </w:p>
         </w:tc>
@@ -3236,6 +3422,130 @@
                 <w:sz w:val="18"/>
               </w:rPr>
               <w:t>3 条记录、2 维，不能外推</w:t>
+            </w:r>
+          </w:p>
+        </w:tc>
+      </w:tr>
+      <w:tr>
+        <w:tc>
+          <w:tcPr>
+            <w:tcW w:type="dxa" w:w="2041"/>
+          </w:tcPr>
+          <w:p>
+            <w:r/>
+            <w:r>
+              <w:rPr>
+                <w:rFonts w:ascii="微软雅黑" w:hAnsi="微软雅黑" w:eastAsia="微软雅黑" w:cs="微软雅黑"/>
+                <w:sz w:val="18"/>
+              </w:rPr>
+              <w:t>DuckDB-Wasm 物化 500k 行</w:t>
+            </w:r>
+          </w:p>
+        </w:tc>
+        <w:tc>
+          <w:tcPr>
+            <w:tcW w:type="dxa" w:w="2154"/>
+          </w:tcPr>
+          <w:p>
+            <w:r/>
+            <w:r>
+              <w:rPr>
+                <w:rFonts w:ascii="微软雅黑" w:hAnsi="微软雅黑" w:eastAsia="微软雅黑" w:cs="微软雅黑"/>
+                <w:sz w:val="18"/>
+              </w:rPr>
+              <w:t>298 ms，RSS ~+76 MB</w:t>
+            </w:r>
+          </w:p>
+        </w:tc>
+        <w:tc>
+          <w:tcPr>
+            <w:tcW w:type="dxa" w:w="3061"/>
+          </w:tcPr>
+          <w:p>
+            <w:r/>
+            <w:r>
+              <w:rPr>
+                <w:rFonts w:ascii="微软雅黑" w:hAnsi="微软雅黑" w:eastAsia="微软雅黑" w:cs="微软雅黑"/>
+                <w:sz w:val="18"/>
+              </w:rPr>
+              <w:t>18.8 MB Parquet，Node 内同一 WASM</w:t>
+            </w:r>
+          </w:p>
+        </w:tc>
+        <w:tc>
+          <w:tcPr>
+            <w:tcW w:type="dxa" w:w="1701"/>
+          </w:tcPr>
+          <w:p>
+            <w:r/>
+            <w:r>
+              <w:rPr>
+                <w:rFonts w:ascii="微软雅黑" w:hAnsi="微软雅黑" w:eastAsia="微软雅黑" w:cs="微软雅黑"/>
+                <w:sz w:val="18"/>
+              </w:rPr>
+              <w:t>约 4× Parquet；浏览器未测</w:t>
+            </w:r>
+          </w:p>
+        </w:tc>
+      </w:tr>
+      <w:tr>
+        <w:tc>
+          <w:tcPr>
+            <w:tcW w:type="dxa" w:w="2041"/>
+          </w:tcPr>
+          <w:p>
+            <w:r/>
+            <w:r>
+              <w:rPr>
+                <w:rFonts w:ascii="微软雅黑" w:hAnsi="微软雅黑" w:eastAsia="微软雅黑" w:cs="微软雅黑"/>
+                <w:sz w:val="18"/>
+              </w:rPr>
+              <w:t>浏览器 SQL 取消</w:t>
+            </w:r>
+          </w:p>
+        </w:tc>
+        <w:tc>
+          <w:tcPr>
+            <w:tcW w:type="dxa" w:w="2154"/>
+          </w:tcPr>
+          <w:p>
+            <w:r/>
+            <w:r>
+              <w:rPr>
+                <w:rFonts w:ascii="微软雅黑" w:hAnsi="微软雅黑" w:eastAsia="微软雅黑" w:cs="微软雅黑"/>
+                <w:sz w:val="18"/>
+              </w:rPr>
+              <w:t>202 ms 查询 → 51 ms 返回</w:t>
+            </w:r>
+          </w:p>
+        </w:tc>
+        <w:tc>
+          <w:tcPr>
+            <w:tcW w:type="dxa" w:w="3061"/>
+          </w:tcPr>
+          <w:p>
+            <w:r/>
+            <w:r>
+              <w:rPr>
+                <w:rFonts w:ascii="微软雅黑" w:hAnsi="微软雅黑" w:eastAsia="微软雅黑" w:cs="微软雅黑"/>
+                <w:sz w:val="18"/>
+              </w:rPr>
+              <w:t>abort 于 50 ms</w:t>
+            </w:r>
+          </w:p>
+        </w:tc>
+        <w:tc>
+          <w:tcPr>
+            <w:tcW w:type="dxa" w:w="1701"/>
+          </w:tcPr>
+          <w:p>
+            <w:r/>
+            <w:r>
+              <w:rPr>
+                <w:rFonts w:ascii="微软雅黑" w:hAnsi="微软雅黑" w:eastAsia="微软雅黑" w:cs="微软雅黑"/>
+                <w:sz w:val="18"/>
+              </w:rPr>
+              <w:t>引擎未停（engineMayStillRun）</w:t>
             </w:r>
           </w:p>
         </w:tc>
@@ -3812,38 +4122,6 @@
                 <w:rFonts w:ascii="微软雅黑" w:hAnsi="微软雅黑" w:eastAsia="微软雅黑" w:cs="微软雅黑"/>
                 <w:sz w:val="18"/>
               </w:rPr>
-              <w:t>DuckDB-Wasm</w:t>
-            </w:r>
-          </w:p>
-        </w:tc>
-        <w:tc>
-          <w:tcPr>
-            <w:tcW w:type="dxa" w:w="6123"/>
-          </w:tcPr>
-          <w:p>
-            <w:r/>
-            <w:r>
-              <w:rPr>
-                <w:rFonts w:ascii="微软雅黑" w:hAnsi="微软雅黑" w:eastAsia="微软雅黑" w:cs="微软雅黑"/>
-                <w:sz w:val="18"/>
-              </w:rPr>
-              <w:t>Parquet 扩展需从外部下载，当前不可达</w:t>
-            </w:r>
-          </w:p>
-        </w:tc>
-      </w:tr>
-      <w:tr>
-        <w:tc>
-          <w:tcPr>
-            <w:tcW w:type="dxa" w:w="2835"/>
-          </w:tcPr>
-          <w:p>
-            <w:r/>
-            <w:r>
-              <w:rPr>
-                <w:rFonts w:ascii="微软雅黑" w:hAnsi="微软雅黑" w:eastAsia="微软雅黑" w:cs="微软雅黑"/>
-                <w:sz w:val="18"/>
-              </w:rPr>
               <w:t>真实 CDN / CORS 验收</w:t>
             </w:r>
           </w:p>
@@ -4151,6 +4429,134 @@
           </w:p>
         </w:tc>
       </w:tr>
+      <w:tr>
+        <w:tc>
+          <w:tcPr>
+            <w:tcW w:type="dxa" w:w="3628"/>
+          </w:tcPr>
+          <w:p>
+            <w:r/>
+            <w:r>
+              <w:rPr>
+                <w:rFonts w:ascii="微软雅黑" w:hAnsi="微软雅黑" w:eastAsia="微软雅黑" w:cs="微软雅黑"/>
+                <w:sz w:val="18"/>
+              </w:rPr>
+              <w:t>浏览器 SQL 参数类型</w:t>
+            </w:r>
+          </w:p>
+        </w:tc>
+        <w:tc>
+          <w:tcPr>
+            <w:tcW w:type="dxa" w:w="5329"/>
+          </w:tcPr>
+          <w:p>
+            <w:r/>
+            <w:r>
+              <w:rPr>
+                <w:rFonts w:ascii="微软雅黑" w:hAnsi="微软雅黑" w:eastAsia="微软雅黑" w:cs="微软雅黑"/>
+                <w:sz w:val="18"/>
+              </w:rPr>
+              <w:t>JSON 绑定；Date、二进制与超范围 bigint 明确拒绝</w:t>
+            </w:r>
+          </w:p>
+        </w:tc>
+      </w:tr>
+      <w:tr>
+        <w:tc>
+          <w:tcPr>
+            <w:tcW w:type="dxa" w:w="3628"/>
+          </w:tcPr>
+          <w:p>
+            <w:r/>
+            <w:r>
+              <w:rPr>
+                <w:rFonts w:ascii="微软雅黑" w:hAnsi="微软雅黑" w:eastAsia="微软雅黑" w:cs="微软雅黑"/>
+                <w:sz w:val="18"/>
+              </w:rPr>
+              <w:t>浏览器 SQL 大结果</w:t>
+            </w:r>
+          </w:p>
+        </w:tc>
+        <w:tc>
+          <w:tcPr>
+            <w:tcW w:type="dxa" w:w="5329"/>
+          </w:tcPr>
+          <w:p>
+            <w:r/>
+            <w:r>
+              <w:rPr>
+                <w:rFonts w:ascii="微软雅黑" w:hAnsi="微软雅黑" w:eastAsia="微软雅黑" w:cs="微软雅黑"/>
+                <w:sz w:val="18"/>
+              </w:rPr>
+              <w:t>一次性返回全部行，没有行数上限或流式返回</w:t>
+            </w:r>
+          </w:p>
+        </w:tc>
+      </w:tr>
+      <w:tr>
+        <w:tc>
+          <w:tcPr>
+            <w:tcW w:type="dxa" w:w="3628"/>
+          </w:tcPr>
+          <w:p>
+            <w:r/>
+            <w:r>
+              <w:rPr>
+                <w:rFonts w:ascii="微软雅黑" w:hAnsi="微软雅黑" w:eastAsia="微软雅黑" w:cs="微软雅黑"/>
+                <w:sz w:val="18"/>
+              </w:rPr>
+              <w:t>浏览器大表与冷启动</w:t>
+            </w:r>
+          </w:p>
+        </w:tc>
+        <w:tc>
+          <w:tcPr>
+            <w:tcW w:type="dxa" w:w="5329"/>
+          </w:tcPr>
+          <w:p>
+            <w:r/>
+            <w:r>
+              <w:rPr>
+                <w:rFonts w:ascii="微软雅黑" w:hAnsi="微软雅黑" w:eastAsia="微软雅黑" w:cs="微软雅黑"/>
+                <w:sz w:val="18"/>
+              </w:rPr>
+              <w:t>只测了 Node 内的同一 WASM 构建（500k 行），浏览器内存与 34 MB 首载未测</w:t>
+            </w:r>
+          </w:p>
+        </w:tc>
+      </w:tr>
+      <w:tr>
+        <w:tc>
+          <w:tcPr>
+            <w:tcW w:type="dxa" w:w="3628"/>
+          </w:tcPr>
+          <w:p>
+            <w:r/>
+            <w:r>
+              <w:rPr>
+                <w:rFonts w:ascii="微软雅黑" w:hAnsi="微软雅黑" w:eastAsia="微软雅黑" w:cs="微软雅黑"/>
+                <w:sz w:val="18"/>
+              </w:rPr>
+              <w:t>COI / 多线程</w:t>
+            </w:r>
+          </w:p>
+        </w:tc>
+        <w:tc>
+          <w:tcPr>
+            <w:tcW w:type="dxa" w:w="5329"/>
+          </w:tcPr>
+          <w:p>
+            <w:r/>
+            <w:r>
+              <w:rPr>
+                <w:rFonts w:ascii="微软雅黑" w:hAnsi="微软雅黑" w:eastAsia="微软雅黑" w:cs="微软雅黑"/>
+                <w:sz w:val="18"/>
+              </w:rPr>
+              <w:t>已试不可用：parquet 扩展与共享内存 ABI 不兼容（ADR-063）</w:t>
+            </w:r>
+          </w:p>
+        </w:tc>
+      </w:tr>
     </w:tbl>
     <w:p>
       <w:pPr>
@@ -4167,7 +4573,7 @@
           <w:color w:val="595959"/>
           <w:sz w:val="20"/>
         </w:rPr>
-        <w:t>完整 45 条记录见仓库 docs/DECISION_LOG.md；下表列出与外部读者最相关的决策。</w:t>
+        <w:t>完整 66 条记录见仓库 docs/DECISION_LOG.md；下表列出与外部读者最相关的决策。</w:t>
       </w:r>
     </w:p>
     <w:tbl>
@@ -4604,6 +5010,134 @@
                 <w:sz w:val="18"/>
               </w:rPr>
               <w:t>Apache-2.0 每包自带许可证；容器防穿越；不可信输入错误契约</w:t>
+            </w:r>
+          </w:p>
+        </w:tc>
+      </w:tr>
+      <w:tr>
+        <w:tc>
+          <w:tcPr>
+            <w:tcW w:type="dxa" w:w="2041"/>
+          </w:tcPr>
+          <w:p>
+            <w:r/>
+            <w:r>
+              <w:rPr>
+                <w:rFonts w:ascii="微软雅黑" w:hAnsi="微软雅黑" w:eastAsia="微软雅黑" w:cs="微软雅黑"/>
+                <w:sz w:val="18"/>
+              </w:rPr>
+              <w:t>057</w:t>
+            </w:r>
+          </w:p>
+        </w:tc>
+        <w:tc>
+          <w:tcPr>
+            <w:tcW w:type="dxa" w:w="6917"/>
+          </w:tcPr>
+          <w:p>
+            <w:r/>
+            <w:r>
+              <w:rPr>
+                <w:rFonts w:ascii="微软雅黑" w:hAnsi="微软雅黑" w:eastAsia="微软雅黑" w:cs="微软雅黑"/>
+                <w:sz w:val="18"/>
+              </w:rPr>
+              <w:t>Builder 在构建时签名，发布链路少一步补签</w:t>
+            </w:r>
+          </w:p>
+        </w:tc>
+      </w:tr>
+      <w:tr>
+        <w:tc>
+          <w:tcPr>
+            <w:tcW w:type="dxa" w:w="2041"/>
+          </w:tcPr>
+          <w:p>
+            <w:r/>
+            <w:r>
+              <w:rPr>
+                <w:rFonts w:ascii="微软雅黑" w:hAnsi="微软雅黑" w:eastAsia="微软雅黑" w:cs="微软雅黑"/>
+                <w:sz w:val="18"/>
+              </w:rPr>
+              <w:t>065 / 066</w:t>
+            </w:r>
+          </w:p>
+        </w:tc>
+        <w:tc>
+          <w:tcPr>
+            <w:tcW w:type="dxa" w:w="6917"/>
+          </w:tcPr>
+          <w:p>
+            <w:r/>
+            <w:r>
+              <w:rPr>
+                <w:rFonts w:ascii="微软雅黑" w:hAnsi="微软雅黑" w:eastAsia="微软雅黑" w:cs="微软雅黑"/>
+                <w:sz w:val="18"/>
+              </w:rPr>
+              <w:t>浏览器 SQL 用 DuckDB-Wasm、扩展同源自托管；066 用 tokenizer 支持只读 CTE</w:t>
+            </w:r>
+          </w:p>
+        </w:tc>
+      </w:tr>
+      <w:tr>
+        <w:tc>
+          <w:tcPr>
+            <w:tcW w:type="dxa" w:w="2041"/>
+          </w:tcPr>
+          <w:p>
+            <w:r/>
+            <w:r>
+              <w:rPr>
+                <w:rFonts w:ascii="微软雅黑" w:hAnsi="微软雅黑" w:eastAsia="微软雅黑" w:cs="微软雅黑"/>
+                <w:sz w:val="18"/>
+              </w:rPr>
+              <w:t>063 / 064</w:t>
+            </w:r>
+          </w:p>
+        </w:tc>
+        <w:tc>
+          <w:tcPr>
+            <w:tcW w:type="dxa" w:w="6917"/>
+          </w:tcPr>
+          <w:p>
+            <w:r/>
+            <w:r>
+              <w:rPr>
+                <w:rFonts w:ascii="微软雅黑" w:hAnsi="微软雅黑" w:eastAsia="微软雅黑" w:cs="微软雅黑"/>
+                <w:sz w:val="18"/>
+              </w:rPr>
+              <w:t>COI 多线程因扩展不兼容不采用；取消只承诺立即停止等待</w:t>
+            </w:r>
+          </w:p>
+        </w:tc>
+      </w:tr>
+      <w:tr>
+        <w:tc>
+          <w:tcPr>
+            <w:tcW w:type="dxa" w:w="2041"/>
+          </w:tcPr>
+          <w:p>
+            <w:r/>
+            <w:r>
+              <w:rPr>
+                <w:rFonts w:ascii="微软雅黑" w:hAnsi="微软雅黑" w:eastAsia="微软雅黑" w:cs="微软雅黑"/>
+                <w:sz w:val="18"/>
+              </w:rPr>
+              <w:t>067</w:t>
+            </w:r>
+          </w:p>
+        </w:tc>
+        <w:tc>
+          <w:tcPr>
+            <w:tcW w:type="dxa" w:w="6917"/>
+          </w:tcPr>
+          <w:p>
+            <w:r/>
+            <w:r>
+              <w:rPr>
+                <w:rFonts w:ascii="微软雅黑" w:hAnsi="微软雅黑" w:eastAsia="微软雅黑" w:cs="微软雅黑"/>
+                <w:sz w:val="18"/>
+              </w:rPr>
+              <w:t>物化预算分单表与整包两层，且在建库前检查</w:t>
             </w:r>
           </w:p>
         </w:tc>
@@ -4698,7 +5232,7 @@
                 <w:rFonts w:ascii="微软雅黑" w:hAnsi="微软雅黑" w:eastAsia="微软雅黑" w:cs="微软雅黑"/>
                 <w:sz w:val="18"/>
               </w:rPr>
-              <w:t>✓ 307 测试，typecheck 通过</w:t>
+              <w:t>✓ 315 测试，typecheck 通过</w:t>
             </w:r>
           </w:p>
         </w:tc>
@@ -4939,7 +5473,7 @@
           <w:rFonts w:ascii="微软雅黑" w:hAnsi="微软雅黑" w:eastAsia="微软雅黑" w:cs="微软雅黑"/>
           <w:sz w:val="21"/>
         </w:rPr>
-        <w:t>1. 配置 npm 令牌 → npm publish --dry-run 核对四个包 → 正式发布。</w:t>
+        <w:t>1. 配置 npm 令牌 → npm publish --dry-run 核对五个包 → 正式发布。</w:t>
       </w:r>
     </w:p>
     <w:p>
@@ -4957,7 +5491,7 @@
           <w:rFonts w:ascii="微软雅黑" w:hAnsi="微软雅黑" w:eastAsia="微软雅黑" w:cs="微软雅黑"/>
           <w:sz w:val="21"/>
         </w:rPr>
-        <w:t>3. 第二台机器复现基准，形成区间而非单点。</w:t>
+        <w:t>3. 补齐 SQL Adapter 的共享契约测试，覆盖 Node 与 DuckDB-Wasm 两个实现。</w:t>
       </w:r>
     </w:p>
     <w:p>
@@ -4966,7 +5500,25 @@
           <w:rFonts w:ascii="微软雅黑" w:hAnsi="微软雅黑" w:eastAsia="微软雅黑" w:cs="微软雅黑"/>
           <w:sz w:val="21"/>
         </w:rPr>
-        <w:t>4. 视需要再做压缩算法协商或源数据的时间戳推断。</w:t>
+        <w:t>4. 为 db.sql 增加行数上限或流式返回，避免大结果把浏览器打爆。</w:t>
+      </w:r>
+    </w:p>
+    <w:p>
+      <w:r>
+        <w:rPr>
+          <w:rFonts w:ascii="微软雅黑" w:hAnsi="微软雅黑" w:eastAsia="微软雅黑" w:cs="微软雅黑"/>
+          <w:sz w:val="21"/>
+        </w:rPr>
+        <w:t>5. 第二台机器复现基准，并在真实 CDN 上验收 CORS / Range / 缓存。</w:t>
+      </w:r>
+    </w:p>
+    <w:p>
+      <w:r>
+        <w:rPr>
+          <w:rFonts w:ascii="微软雅黑" w:hAnsi="微软雅黑" w:eastAsia="微软雅黑" w:cs="微软雅黑"/>
+          <w:sz w:val="21"/>
+        </w:rPr>
+        <w:t>6. 视需要再做压缩算法协商或源数据的时间戳推断。</w:t>
       </w:r>
     </w:p>
     <w:sectPr>

</xml_diff>

<commit_message>
feat: decide the JSON contract and add a real-data recall harness
</commit_message>
<xml_diff>
--- a/docs/WeiSQL-项目状态报告.docx
+++ b/docs/WeiSQL-项目状态报告.docx
@@ -40,7 +40,7 @@
           <w:rFonts w:ascii="微软雅黑" w:hAnsi="微软雅黑" w:eastAsia="微软雅黑" w:cs="微软雅黑"/>
           <w:sz w:val="21"/>
         </w:rPr>
-        <w:t>工程原型。Manifest V1 与数据包格式稳定，五个包共 315 个自动化测试，CI 覆盖构建、类型、测试与发布元数据；精确检索、ANN、全文、融合、RAG、单文件容器与浏览器 SQL 均有实现与实测数字。尚未发布 npm 包，也没有任何未经测量的性能承诺。</w:t>
+        <w:t>工程原型。Manifest V1 与数据包格式稳定，五个包共 316 个自动化测试，CI 覆盖构建、类型、测试与发布元数据；精确检索、ANN、全文、融合、RAG、单文件容器与浏览器 SQL 均有实现与实测数字。尚未发布 npm 包，也没有任何未经测量的性能承诺。</w:t>
       </w:r>
     </w:p>
     <w:tbl>
@@ -124,7 +124,7 @@
                 <w:rFonts w:ascii="微软雅黑" w:hAnsi="微软雅黑" w:eastAsia="微软雅黑" w:cs="微软雅黑"/>
                 <w:sz w:val="18"/>
               </w:rPr>
-              <w:t>315 个全绿（SDK 207 / DuckDB 21 / WASM 36 / USearch 13 / CLI 38）</w:t>
+              <w:t>316 个全绿（SDK 207 / DuckDB 22 / WASM 36 / USearch 13 / CLI 38）</w:t>
             </w:r>
           </w:p>
         </w:tc>
@@ -2400,7 +2400,7 @@
                 <w:rFonts w:ascii="微软雅黑" w:hAnsi="微软雅黑" w:eastAsia="微软雅黑" w:cs="微软雅黑"/>
                 <w:sz w:val="18"/>
               </w:rPr>
-              <w:t>21</w:t>
+              <w:t>22</w:t>
             </w:r>
           </w:p>
         </w:tc>
@@ -2588,7 +2588,7 @@
                 <w:rFonts w:ascii="微软雅黑" w:hAnsi="微软雅黑" w:eastAsia="微软雅黑" w:cs="微软雅黑"/>
                 <w:sz w:val="18"/>
               </w:rPr>
-              <w:t>315</w:t>
+              <w:t>316</w:t>
             </w:r>
           </w:p>
         </w:tc>
@@ -5232,7 +5232,7 @@
                 <w:rFonts w:ascii="微软雅黑" w:hAnsi="微软雅黑" w:eastAsia="微软雅黑" w:cs="微软雅黑"/>
                 <w:sz w:val="18"/>
               </w:rPr>
-              <w:t>✓ 315 测试，typecheck 通过</w:t>
+              <w:t>✓ 316 测试，typecheck 通过</w:t>
             </w:r>
           </w:p>
         </w:tc>

</xml_diff>

<commit_message>
docs: align counts with the committed tree
</commit_message>
<xml_diff>
--- a/docs/WeiSQL-项目状态报告.docx
+++ b/docs/WeiSQL-项目状态报告.docx
@@ -23,7 +23,7 @@
           <w:color w:val="595959"/>
           <w:sz w:val="20"/>
         </w:rPr>
-        <w:t>2026-10-31 · 仓库 HEAD 0dfb70f · 315 个自动化测试 · 尚未发布 npm</w:t>
+        <w:t>2026-10-31 · 仓库 HEAD 9e61268 · 318 个自动化测试 · 尚未发布 npm</w:t>
       </w:r>
     </w:p>
     <w:p>
@@ -40,7 +40,7 @@
           <w:rFonts w:ascii="微软雅黑" w:hAnsi="微软雅黑" w:eastAsia="微软雅黑" w:cs="微软雅黑"/>
           <w:sz w:val="21"/>
         </w:rPr>
-        <w:t>工程原型。Manifest V1 与数据包格式稳定，五个包共 316 个自动化测试，CI 覆盖构建、类型、测试与发布元数据；精确检索、ANN、全文、融合、RAG、单文件容器与浏览器 SQL 均有实现与实测数字。尚未发布 npm 包，也没有任何未经测量的性能承诺。</w:t>
+        <w:t>工程原型。Manifest V1 与数据包格式稳定，五个包共 318 个自动化测试，CI 覆盖构建、类型、测试与发布元数据；精确检索、ANN、全文、融合、RAG、单文件容器与浏览器 SQL 均有实现与实测数字。尚未发布 npm 包，也没有任何未经测量的性能承诺。</w:t>
       </w:r>
     </w:p>
     <w:tbl>
@@ -124,7 +124,7 @@
                 <w:rFonts w:ascii="微软雅黑" w:hAnsi="微软雅黑" w:eastAsia="微软雅黑" w:cs="微软雅黑"/>
                 <w:sz w:val="18"/>
               </w:rPr>
-              <w:t>316 个全绿（SDK 207 / DuckDB 22 / WASM 36 / USearch 13 / CLI 38）</w:t>
+              <w:t>318 个全绿（SDK 207 / DuckDB 23 / WASM 37 / USearch 13 / CLI 38）</w:t>
             </w:r>
           </w:p>
         </w:tc>
@@ -2400,7 +2400,7 @@
                 <w:rFonts w:ascii="微软雅黑" w:hAnsi="微软雅黑" w:eastAsia="微软雅黑" w:cs="微软雅黑"/>
                 <w:sz w:val="18"/>
               </w:rPr>
-              <w:t>22</w:t>
+              <w:t>23</w:t>
             </w:r>
           </w:p>
         </w:tc>
@@ -2447,7 +2447,7 @@
                 <w:rFonts w:ascii="微软雅黑" w:hAnsi="微软雅黑" w:eastAsia="微软雅黑" w:cs="微软雅黑"/>
                 <w:sz w:val="18"/>
               </w:rPr>
-              <w:t>36</w:t>
+              <w:t>37</w:t>
             </w:r>
           </w:p>
         </w:tc>
@@ -2588,7 +2588,7 @@
                 <w:rFonts w:ascii="微软雅黑" w:hAnsi="微软雅黑" w:eastAsia="微软雅黑" w:cs="微软雅黑"/>
                 <w:sz w:val="18"/>
               </w:rPr>
-              <w:t>316</w:t>
+              <w:t>318</w:t>
             </w:r>
           </w:p>
         </w:tc>
@@ -4473,7 +4473,7 @@
                 <w:rFonts w:ascii="微软雅黑" w:hAnsi="微软雅黑" w:eastAsia="微软雅黑" w:cs="微软雅黑"/>
                 <w:sz w:val="18"/>
               </w:rPr>
-              <w:t>浏览器 SQL 大结果</w:t>
+              <w:t>SQL 结果规模</w:t>
             </w:r>
           </w:p>
         </w:tc>
@@ -4488,7 +4488,7 @@
                 <w:rFonts w:ascii="微软雅黑" w:hAnsi="微软雅黑" w:eastAsia="微软雅黑" w:cs="微软雅黑"/>
                 <w:sz w:val="18"/>
               </w:rPr>
-              <w:t>一次性返回全部行，没有行数上限或流式返回</w:t>
+              <w:t>maxRows 会在超限时硬失败；结果仍是一次性数组，流式返回未实现</w:t>
             </w:r>
           </w:p>
         </w:tc>
@@ -4573,7 +4573,7 @@
           <w:color w:val="595959"/>
           <w:sz w:val="20"/>
         </w:rPr>
-        <w:t>完整 66 条记录见仓库 docs/DECISION_LOG.md；下表列出与外部读者最相关的决策。</w:t>
+        <w:t>完整 69 条记录见仓库 docs/DECISION_LOG.md；下表列出与外部读者最相关的决策。</w:t>
       </w:r>
     </w:p>
     <w:tbl>
@@ -5232,7 +5232,7 @@
                 <w:rFonts w:ascii="微软雅黑" w:hAnsi="微软雅黑" w:eastAsia="微软雅黑" w:cs="微软雅黑"/>
                 <w:sz w:val="18"/>
               </w:rPr>
-              <w:t>✓ 316 测试，typecheck 通过</w:t>
+              <w:t>✓ 318 测试，typecheck 通过</w:t>
             </w:r>
           </w:p>
         </w:tc>

</xml_diff>

<commit_message>
docs: measure quantization on clustered vectors
</commit_message>
<xml_diff>
--- a/docs/WeiSQL-项目状态报告.docx
+++ b/docs/WeiSQL-项目状态报告.docx
@@ -23,7 +23,7 @@
           <w:color w:val="595959"/>
           <w:sz w:val="20"/>
         </w:rPr>
-        <w:t>2026-10-31 · 仓库 HEAD 0bc3b80 · 318 个自动化测试 · 尚未发布 npm</w:t>
+        <w:t>2026-10-31 · 仓库 HEAD c6fcfae · 321 个自动化测试 · 尚未发布 npm</w:t>
       </w:r>
     </w:p>
     <w:p>
@@ -40,7 +40,7 @@
           <w:rFonts w:ascii="微软雅黑" w:hAnsi="微软雅黑" w:eastAsia="微软雅黑" w:cs="微软雅黑"/>
           <w:sz w:val="21"/>
         </w:rPr>
-        <w:t>工程原型。Manifest V1 与数据包格式稳定，五个包共 318 个自动化测试，CI 覆盖构建、类型、测试与发布元数据；精确检索、ANN、全文、融合、RAG、单文件容器与浏览器 SQL 均有实现与实测数字。尚未发布 npm 包，也没有任何未经测量的性能承诺。</w:t>
+        <w:t>工程原型。Manifest V1 与数据包格式稳定，五个包共 321 个自动化测试，CI 覆盖构建、类型、测试与发布元数据；精确检索、ANN、全文、融合、RAG、单文件容器与浏览器 SQL 均有实现与实测数字。尚未发布 npm 包，也没有任何未经测量的性能承诺。</w:t>
       </w:r>
     </w:p>
     <w:tbl>
@@ -124,7 +124,7 @@
                 <w:rFonts w:ascii="微软雅黑" w:hAnsi="微软雅黑" w:eastAsia="微软雅黑" w:cs="微软雅黑"/>
                 <w:sz w:val="18"/>
               </w:rPr>
-              <w:t>318 个全绿（SDK 207 / DuckDB 23 / WASM 37 / USearch 13 / CLI 38）</w:t>
+              <w:t>321 个全绿（SDK 208 / DuckDB 24 / WASM 38 / USearch 13 / CLI 38）</w:t>
             </w:r>
           </w:p>
         </w:tc>
@@ -2588,7 +2588,7 @@
                 <w:rFonts w:ascii="微软雅黑" w:hAnsi="微软雅黑" w:eastAsia="微软雅黑" w:cs="微软雅黑"/>
                 <w:sz w:val="18"/>
               </w:rPr>
-              <w:t>318</w:t>
+              <w:t>321</w:t>
             </w:r>
           </w:p>
         </w:tc>
@@ -3128,7 +3128,7 @@
                 <w:rFonts w:ascii="微软雅黑" w:hAnsi="微软雅黑" w:eastAsia="微软雅黑" w:cs="微软雅黑"/>
                 <w:sz w:val="18"/>
               </w:rPr>
-              <w:t>量化（合成）</w:t>
+              <w:t>量化（合成，成簇）</w:t>
             </w:r>
           </w:p>
         </w:tc>
@@ -3143,7 +3143,7 @@
                 <w:rFonts w:ascii="微软雅黑" w:hAnsi="微软雅黑" w:eastAsia="微软雅黑" w:cs="微软雅黑"/>
                 <w:sz w:val="18"/>
               </w:rPr>
-              <w:t>f16 −39% / i8 −58% 体积</w:t>
+              <w:t>f16 −39% 无损 / i8 −58% 掉 9.5 点</w:t>
             </w:r>
           </w:p>
         </w:tc>
@@ -3158,7 +3158,7 @@
                 <w:rFonts w:ascii="微软雅黑" w:hAnsi="微软雅黑" w:eastAsia="微软雅黑" w:cs="微软雅黑"/>
                 <w:sz w:val="18"/>
               </w:rPr>
-              <w:t>50k × 128，均匀随机</w:t>
+              <w:t>50k × 128，64 簇</w:t>
             </w:r>
           </w:p>
         </w:tc>
@@ -3173,7 +3173,7 @@
                 <w:rFonts w:ascii="微软雅黑" w:hAnsi="微软雅黑" w:eastAsia="微软雅黑" w:cs="微软雅黑"/>
                 <w:sz w:val="18"/>
               </w:rPr>
-              <w:t>召回 0.81 → 0.775 / 0.785；真实语料未测</w:t>
+              <w:t>提高 expansion 不能恢复 i8；真实语料未测</w:t>
             </w:r>
           </w:p>
         </w:tc>
@@ -4488,7 +4488,7 @@
                 <w:rFonts w:ascii="微软雅黑" w:hAnsi="微软雅黑" w:eastAsia="微软雅黑" w:cs="微软雅黑"/>
                 <w:sz w:val="18"/>
               </w:rPr>
-              <w:t>maxRows 会在超限时硬失败；结果仍是一次性数组，流式返回未实现</w:t>
+              <w:t>maxRows 超限硬失败；sqlStream() 提供增量交付，db.sql() 仍一次性返回</w:t>
             </w:r>
           </w:p>
         </w:tc>
@@ -4573,7 +4573,7 @@
           <w:color w:val="595959"/>
           <w:sz w:val="20"/>
         </w:rPr>
-        <w:t>完整 69 条记录见仓库 docs/DECISION_LOG.md；下表列出与外部读者最相关的决策。</w:t>
+        <w:t>完整 70 条记录见仓库 docs/DECISION_LOG.md；下表列出与外部读者最相关的决策。</w:t>
       </w:r>
     </w:p>
     <w:tbl>
@@ -5232,7 +5232,7 @@
                 <w:rFonts w:ascii="微软雅黑" w:hAnsi="微软雅黑" w:eastAsia="微软雅黑" w:cs="微软雅黑"/>
                 <w:sz w:val="18"/>
               </w:rPr>
-              <w:t>✓ 318 测试，typecheck 通过</w:t>
+              <w:t>✓ 321 测试，typecheck 通过</w:t>
             </w:r>
           </w:p>
         </w:tc>

</xml_diff>

<commit_message>
docs: align the test count with the current tree
</commit_message>
<xml_diff>
--- a/docs/WeiSQL-项目状态报告.docx
+++ b/docs/WeiSQL-项目状态报告.docx
@@ -2353,7 +2353,7 @@
                 <w:rFonts w:ascii="微软雅黑" w:hAnsi="微软雅黑" w:eastAsia="微软雅黑" w:cs="微软雅黑"/>
                 <w:sz w:val="18"/>
               </w:rPr>
-              <w:t>207</w:t>
+              <w:t>208</w:t>
             </w:r>
           </w:p>
         </w:tc>
@@ -2400,7 +2400,7 @@
                 <w:rFonts w:ascii="微软雅黑" w:hAnsi="微软雅黑" w:eastAsia="微软雅黑" w:cs="微软雅黑"/>
                 <w:sz w:val="18"/>
               </w:rPr>
-              <w:t>23</w:t>
+              <w:t>24</w:t>
             </w:r>
           </w:p>
         </w:tc>
@@ -2447,7 +2447,7 @@
                 <w:rFonts w:ascii="微软雅黑" w:hAnsi="微软雅黑" w:eastAsia="微软雅黑" w:cs="微软雅黑"/>
                 <w:sz w:val="18"/>
               </w:rPr>
-              <w:t>37</w:t>
+              <w:t>38</w:t>
             </w:r>
           </w:p>
         </w:tc>

</xml_diff>

<commit_message>
fix: choose filtered scans by request cost, not allowed-row fraction
</commit_message>
<xml_diff>
--- a/docs/WeiSQL-项目状态报告.docx
+++ b/docs/WeiSQL-项目状态报告.docx
@@ -23,7 +23,7 @@
           <w:color w:val="595959"/>
           <w:sz w:val="20"/>
         </w:rPr>
-        <w:t>2026-10-31 · 仓库 HEAD 2b6dd7c · 321 个自动化测试 · 尚未发布 npm</w:t>
+        <w:t>2026-10-31 · 仓库 HEAD 1774e8e · 321 个自动化测试 · 尚未发布 npm</w:t>
       </w:r>
     </w:p>
     <w:p>
@@ -40,7 +40,7 @@
           <w:rFonts w:ascii="微软雅黑" w:hAnsi="微软雅黑" w:eastAsia="微软雅黑" w:cs="微软雅黑"/>
           <w:sz w:val="21"/>
         </w:rPr>
-        <w:t>工程原型。Manifest V1 与数据包格式稳定，五个包共 321 个自动化测试，CI 覆盖构建、类型、测试与发布元数据；精确检索、ANN、全文、融合、RAG、单文件容器与浏览器 SQL 均有实现与实测数字。尚未发布 npm 包，也没有任何未经测量的性能承诺。</w:t>
+        <w:t>工程原型。Manifest V1 与数据包格式稳定，五个包共 322 个自动化测试，CI 覆盖构建、类型、测试与发布元数据；精确检索、ANN、全文、融合、RAG、单文件容器与浏览器 SQL 均有实现与实测数字。尚未发布 npm 包，也没有任何未经测量的性能承诺。</w:t>
       </w:r>
     </w:p>
     <w:tbl>
@@ -124,7 +124,7 @@
                 <w:rFonts w:ascii="微软雅黑" w:hAnsi="微软雅黑" w:eastAsia="微软雅黑" w:cs="微软雅黑"/>
                 <w:sz w:val="18"/>
               </w:rPr>
-              <w:t>321 个全绿（SDK 208 / DuckDB 24 / WASM 38 / USearch 13 / CLI 38）</w:t>
+              <w:t>322 个全绿（SDK 209 / DuckDB 24 / WASM 38 / USearch 13 / CLI 38）</w:t>
             </w:r>
           </w:p>
         </w:tc>
@@ -2353,7 +2353,7 @@
                 <w:rFonts w:ascii="微软雅黑" w:hAnsi="微软雅黑" w:eastAsia="微软雅黑" w:cs="微软雅黑"/>
                 <w:sz w:val="18"/>
               </w:rPr>
-              <w:t>208</w:t>
+              <w:t>209</w:t>
             </w:r>
           </w:p>
         </w:tc>
@@ -2588,7 +2588,7 @@
                 <w:rFonts w:ascii="微软雅黑" w:hAnsi="微软雅黑" w:eastAsia="微软雅黑" w:cs="微软雅黑"/>
                 <w:sz w:val="18"/>
               </w:rPr>
-              <w:t>321</w:t>
+              <w:t>322</w:t>
             </w:r>
           </w:p>
         </w:tc>
@@ -3066,7 +3066,7 @@
                 <w:rFonts w:ascii="微软雅黑" w:hAnsi="微软雅黑" w:eastAsia="微软雅黑" w:cs="微软雅黑"/>
                 <w:sz w:val="18"/>
               </w:rPr>
-              <w:t>过滤查询（窄过滤）</w:t>
+              <w:t>过滤查询（窄连续）</w:t>
             </w:r>
           </w:p>
         </w:tc>
@@ -3081,7 +3081,7 @@
                 <w:rFonts w:ascii="微软雅黑" w:hAnsi="微软雅黑" w:eastAsia="微软雅黑" w:cs="微软雅黑"/>
                 <w:sz w:val="18"/>
               </w:rPr>
-              <w:t>p50 17.1 ms</w:t>
+              <w:t>p50 15.1 ms</w:t>
             </w:r>
           </w:p>
         </w:tc>
@@ -3111,7 +3111,7 @@
                 <w:rFonts w:ascii="微软雅黑" w:hAnsi="微软雅黑" w:eastAsia="微软雅黑" w:cs="微软雅黑"/>
                 <w:sz w:val="18"/>
               </w:rPr>
-              <w:t>反向索引把 ID Map 读取从 4.0 MB 降到 480 B</w:t>
+              <w:t>反向索引 + 连续段读取；散乱 1/8 回退顺序扫描 135 ms</w:t>
             </w:r>
           </w:p>
         </w:tc>
@@ -3515,7 +3515,7 @@
                 <w:rFonts w:ascii="微软雅黑" w:hAnsi="微软雅黑" w:eastAsia="微软雅黑" w:cs="微软雅黑"/>
                 <w:sz w:val="18"/>
               </w:rPr>
-              <w:t>100k/1M/5M：113/1,058/6,784 ms，首行 7–15 ms</w:t>
+              <w:t>100k/1M/5M：135/685/5,158 ms，首行 3–23 ms</w:t>
             </w:r>
           </w:p>
         </w:tc>
@@ -3546,6 +3546,68 @@
                 <w:sz w:val="18"/>
               </w:rPr>
               <w:t>单次运行、合成数据</w:t>
+            </w:r>
+          </w:p>
+        </w:tc>
+      </w:tr>
+      <w:tr>
+        <w:tc>
+          <w:tcPr>
+            <w:tcW w:type="dxa" w:w="2041"/>
+          </w:tcPr>
+          <w:p>
+            <w:r/>
+            <w:r>
+              <w:rPr>
+                <w:rFonts w:ascii="微软雅黑" w:hAnsi="微软雅黑" w:eastAsia="微软雅黑" w:cs="微软雅黑"/>
+                <w:sz w:val="18"/>
+              </w:rPr>
+              <w:t>浏览器 Parquet 流式</w:t>
+            </w:r>
+          </w:p>
+        </w:tc>
+        <w:tc>
+          <w:tcPr>
+            <w:tcW w:type="dxa" w:w="2154"/>
+          </w:tcPr>
+          <w:p>
+            <w:r/>
+            <w:r>
+              <w:rPr>
+                <w:rFonts w:ascii="微软雅黑" w:hAnsi="微软雅黑" w:eastAsia="微软雅黑" w:cs="微软雅黑"/>
+                <w:sz w:val="18"/>
+              </w:rPr>
+              <w:t>20 万行：流式 595 ms、堆 +20.5 MB；db.sql 434 ms、堆 +40.5 MB</w:t>
+            </w:r>
+          </w:p>
+        </w:tc>
+        <w:tc>
+          <w:tcPr>
+            <w:tcW w:type="dxa" w:w="3061"/>
+          </w:tcPr>
+          <w:p>
+            <w:r/>
+            <w:r>
+              <w:rPr>
+                <w:rFonts w:ascii="微软雅黑" w:hAnsi="微软雅黑" w:eastAsia="微软雅黑" w:cs="微软雅黑"/>
+                <w:sz w:val="18"/>
+              </w:rPr>
+              <w:t>7.5 MB Parquet，Range + L3 + 物化</w:t>
+            </w:r>
+          </w:p>
+        </w:tc>
+        <w:tc>
+          <w:tcPr>
+            <w:tcW w:type="dxa" w:w="1701"/>
+          </w:tcPr>
+          <w:p>
+            <w:r/>
+            <w:r>
+              <w:rPr>
+                <w:rFonts w:ascii="微软雅黑" w:hAnsi="微软雅黑" w:eastAsia="微软雅黑" w:cs="微软雅黑"/>
+                <w:sz w:val="18"/>
+              </w:rPr>
+              <w:t>open() 1,716 ms</w:t>
             </w:r>
           </w:p>
         </w:tc>
@@ -5294,7 +5356,7 @@
                 <w:rFonts w:ascii="微软雅黑" w:hAnsi="微软雅黑" w:eastAsia="微软雅黑" w:cs="微软雅黑"/>
                 <w:sz w:val="18"/>
               </w:rPr>
-              <w:t>✓ 321 测试，typecheck 通过</w:t>
+              <w:t>✓ 322 测试，typecheck 通过</w:t>
             </w:r>
           </w:p>
         </w:tc>

</xml_diff>

<commit_message>
feat: add end-to-end tutorial and API reference to documentation
- Updated quickstart guide to include a link to the new end-to-end tutorial.
- Created a comprehensive end-to-end tutorial that guides users from CSV to deployable data packages.
- Added API reference section to the documentation with links to individual API methods.
- Enhanced the homepage to feature the new API section and tutorial link.
- Introduced new UI components for better documentation presentation.
- Improved styling for API sections and documentation layout.
</commit_message>
<xml_diff>
--- a/docs/WeiSQL-项目状态报告.docx
+++ b/docs/WeiSQL-项目状态报告.docx
@@ -23,7 +23,7 @@
           <w:color w:val="595959"/>
           <w:sz w:val="20"/>
         </w:rPr>
-        <w:t>2026-10-31 · 仓库 HEAD 1774e8e · 321 个自动化测试 · 尚未发布 npm</w:t>
+        <w:t>2026-10-31 · 仓库 HEAD 937f91d · 321 个自动化测试 · 尚未发布 npm</w:t>
       </w:r>
     </w:p>
     <w:p>
@@ -3391,7 +3391,7 @@
                 <w:rFonts w:ascii="微软雅黑" w:hAnsi="微软雅黑" w:eastAsia="微软雅黑" w:cs="微软雅黑"/>
                 <w:sz w:val="18"/>
               </w:rPr>
-              <w:t>8 向量 + 5 文本 + 9 SQL + 2 流式 + RAG + 容器</w:t>
+              <w:t>8 向量 + 5 文本 + 9 SQL + 4 流式 + RAG + 容器</w:t>
             </w:r>
           </w:p>
         </w:tc>

</xml_diff>

<commit_message>
feat: add detailed explanation of WeiSQL's capabilities and use cases in new documentation
</commit_message>
<xml_diff>
--- a/docs/WeiSQL-项目状态报告.docx
+++ b/docs/WeiSQL-项目状态报告.docx
@@ -23,7 +23,7 @@
           <w:color w:val="595959"/>
           <w:sz w:val="20"/>
         </w:rPr>
-        <w:t>2026-10-31 · 仓库 HEAD 937f91d · 321 个自动化测试 · 尚未发布 npm</w:t>
+        <w:t>2026-10-31 · 仓库 HEAD f9b3d6d · 323 个自动化测试 · 尚未发布 npm</w:t>
       </w:r>
     </w:p>
     <w:p>
@@ -40,7 +40,7 @@
           <w:rFonts w:ascii="微软雅黑" w:hAnsi="微软雅黑" w:eastAsia="微软雅黑" w:cs="微软雅黑"/>
           <w:sz w:val="21"/>
         </w:rPr>
-        <w:t>工程原型。Manifest V1 与数据包格式稳定，五个包共 322 个自动化测试，CI 覆盖构建、类型、测试与发布元数据；精确检索、ANN、全文、融合、RAG、单文件容器与浏览器 SQL 均有实现与实测数字。尚未发布 npm 包，也没有任何未经测量的性能承诺。</w:t>
+        <w:t>工程原型。Manifest V1 与数据包格式稳定，五个包共 323 个自动化测试，CI 覆盖构建、类型、测试与发布元数据；精确检索、ANN、全文、融合、RAG、单文件容器与浏览器 SQL 均有实现与实测数字。尚未发布 npm 包，也没有任何未经测量的性能承诺。</w:t>
       </w:r>
     </w:p>
     <w:tbl>
@@ -124,7 +124,7 @@
                 <w:rFonts w:ascii="微软雅黑" w:hAnsi="微软雅黑" w:eastAsia="微软雅黑" w:cs="微软雅黑"/>
                 <w:sz w:val="18"/>
               </w:rPr>
-              <w:t>322 个全绿（SDK 209 / DuckDB 24 / WASM 38 / USearch 13 / CLI 38）</w:t>
+              <w:t>323 个全绿（SDK 209 / DuckDB 25 / WASM 38 / USearch 13 / CLI 38）</w:t>
             </w:r>
           </w:p>
         </w:tc>
@@ -2588,7 +2588,7 @@
                 <w:rFonts w:ascii="微软雅黑" w:hAnsi="微软雅黑" w:eastAsia="微软雅黑" w:cs="微软雅黑"/>
                 <w:sz w:val="18"/>
               </w:rPr>
-              <w:t>322</w:t>
+              <w:t>323</w:t>
             </w:r>
           </w:p>
         </w:tc>
@@ -5356,7 +5356,7 @@
                 <w:rFonts w:ascii="微软雅黑" w:hAnsi="微软雅黑" w:eastAsia="微软雅黑" w:cs="微软雅黑"/>
                 <w:sz w:val="18"/>
               </w:rPr>
-              <w:t>✓ 322 测试，typecheck 通过</w:t>
+              <w:t>✓ 323 测试，typecheck 通过</w:t>
             </w:r>
           </w:p>
         </w:tc>

</xml_diff>

<commit_message>
docs: update project status report and enhance documentation structure
</commit_message>
<xml_diff>
--- a/docs/WeiSQL-项目状态报告.docx
+++ b/docs/WeiSQL-项目状态报告.docx
@@ -23,7 +23,7 @@
           <w:color w:val="595959"/>
           <w:sz w:val="20"/>
         </w:rPr>
-        <w:t>2026-10-31 · 仓库 HEAD f9b3d6d · 323 个自动化测试 · 尚未发布 npm</w:t>
+        <w:t>2026-10-31 · 仓库 HEAD 9d9a338 · 323 个自动化测试 · 尚未发布 npm</w:t>
       </w:r>
     </w:p>
     <w:p>
@@ -3515,7 +3515,7 @@
                 <w:rFonts w:ascii="微软雅黑" w:hAnsi="微软雅黑" w:eastAsia="微软雅黑" w:cs="微软雅黑"/>
                 <w:sz w:val="18"/>
               </w:rPr>
-              <w:t>100k/1M/5M：135/685/5,158 ms，首行 3–23 ms</w:t>
+              <w:t>100k/1M/5M：126/871/4,542 ms，首行 5–16 ms</w:t>
             </w:r>
           </w:p>
         </w:tc>
@@ -3577,7 +3577,7 @@
                 <w:rFonts w:ascii="微软雅黑" w:hAnsi="微软雅黑" w:eastAsia="微软雅黑" w:cs="微软雅黑"/>
                 <w:sz w:val="18"/>
               </w:rPr>
-              <w:t>20 万行：流式 595 ms、堆 +20.5 MB；db.sql 434 ms、堆 +40.5 MB</w:t>
+              <w:t>20 万/50 万行：流式 430/2,165 ms；db.sql 堆 +40.6/+95.4 MB</w:t>
             </w:r>
           </w:p>
         </w:tc>
@@ -3592,7 +3592,7 @@
                 <w:rFonts w:ascii="微软雅黑" w:hAnsi="微软雅黑" w:eastAsia="微软雅黑" w:cs="微软雅黑"/>
                 <w:sz w:val="18"/>
               </w:rPr>
-              <w:t>7.5 MB Parquet，Range + L3 + 物化</w:t>
+              <w:t>7.5/18.8 MB Parquet，Range + L3 + 物化</w:t>
             </w:r>
           </w:p>
         </w:tc>
@@ -3607,7 +3607,7 @@
                 <w:rFonts w:ascii="微软雅黑" w:hAnsi="微软雅黑" w:eastAsia="微软雅黑" w:cs="微软雅黑"/>
                 <w:sz w:val="18"/>
               </w:rPr>
-              <w:t>open() 1,716 ms</w:t>
+              <w:t>open() 1,963/2,430 ms</w:t>
             </w:r>
           </w:p>
         </w:tc>

</xml_diff>

<commit_message>
feat: add support for pre-aborted SQL streams and update related documentation
</commit_message>
<xml_diff>
--- a/docs/WeiSQL-项目状态报告.docx
+++ b/docs/WeiSQL-项目状态报告.docx
@@ -23,7 +23,7 @@
           <w:color w:val="595959"/>
           <w:sz w:val="20"/>
         </w:rPr>
-        <w:t>2026-10-31 · 仓库 HEAD 9d9a338 · 323 个自动化测试 · 尚未发布 npm</w:t>
+        <w:t>2026-10-31 · 仓库 HEAD 9699f06 · 323 个自动化测试 · 尚未发布 npm</w:t>
       </w:r>
     </w:p>
     <w:p>
@@ -3391,7 +3391,7 @@
                 <w:rFonts w:ascii="微软雅黑" w:hAnsi="微软雅黑" w:eastAsia="微软雅黑" w:cs="微软雅黑"/>
                 <w:sz w:val="18"/>
               </w:rPr>
-              <w:t>8 向量 + 5 文本 + 9 SQL + 4 流式 + RAG + 容器</w:t>
+              <w:t>8 向量 + 5 文本 + 9 SQL + 5 流式 + RAG + 容器</w:t>
             </w:r>
           </w:p>
         </w:tc>

</xml_diff>

<commit_message>
feat: update package metadata and enhance cold-start benchmark logging
</commit_message>
<xml_diff>
--- a/docs/WeiSQL-项目状态报告.docx
+++ b/docs/WeiSQL-项目状态报告.docx
@@ -23,7 +23,7 @@
           <w:color w:val="595959"/>
           <w:sz w:val="20"/>
         </w:rPr>
-        <w:t>2026-10-31 · 仓库 HEAD 9699f06 · 323 个自动化测试 · 尚未发布 npm</w:t>
+        <w:t>2026-10-31 · 仓库 HEAD 54d5425 · 323 个自动化测试 · 尚未发布 npm</w:t>
       </w:r>
     </w:p>
     <w:p>
@@ -3608,6 +3608,68 @@
                 <w:sz w:val="18"/>
               </w:rPr>
               <w:t>open() 1,963/2,430 ms</w:t>
+            </w:r>
+          </w:p>
+        </w:tc>
+      </w:tr>
+      <w:tr>
+        <w:tc>
+          <w:tcPr>
+            <w:tcW w:type="dxa" w:w="2041"/>
+          </w:tcPr>
+          <w:p>
+            <w:r/>
+            <w:r>
+              <w:rPr>
+                <w:rFonts w:ascii="微软雅黑" w:hAnsi="微软雅黑" w:eastAsia="微软雅黑" w:cs="微软雅黑"/>
+                <w:sz w:val="18"/>
+              </w:rPr>
+              <w:t>浏览器冷启动</w:t>
+            </w:r>
+          </w:p>
+        </w:tc>
+        <w:tc>
+          <w:tcPr>
+            <w:tcW w:type="dxa" w:w="2154"/>
+          </w:tcPr>
+          <w:p>
+            <w:r/>
+            <w:r>
+              <w:rPr>
+                <w:rFonts w:ascii="微软雅黑" w:hAnsi="微软雅黑" w:eastAsia="微软雅黑" w:cs="微软雅黑"/>
+                <w:sz w:val="18"/>
+              </w:rPr>
+              <w:t>open() 1,817 ms；传输 36.3 MB</w:t>
+            </w:r>
+          </w:p>
+        </w:tc>
+        <w:tc>
+          <w:tcPr>
+            <w:tcW w:type="dxa" w:w="3061"/>
+          </w:tcPr>
+          <w:p>
+            <w:r/>
+            <w:r>
+              <w:rPr>
+                <w:rFonts w:ascii="微软雅黑" w:hAnsi="微软雅黑" w:eastAsia="微软雅黑" w:cs="微软雅黑"/>
+                <w:sz w:val="18"/>
+              </w:rPr>
+              <w:t>Chromium 1248，关闭 HTTP 缓存</w:t>
+            </w:r>
+          </w:p>
+        </w:tc>
+        <w:tc>
+          <w:tcPr>
+            <w:tcW w:type="dxa" w:w="1701"/>
+          </w:tcPr>
+          <w:p>
+            <w:r/>
+            <w:r>
+              <w:rPr>
+                <w:rFonts w:ascii="微软雅黑" w:hAnsi="微软雅黑" w:eastAsia="微软雅黑" w:cs="微软雅黑"/>
+                <w:sz w:val="18"/>
+              </w:rPr>
+              <w:t>本地服务器，无 CDN</w:t>
             </w:r>
           </w:p>
         </w:tc>

</xml_diff>

<commit_message>
feat: add SQL adapter contract tests to CI workflow and update documentation
</commit_message>
<xml_diff>
--- a/docs/WeiSQL-项目状态报告.docx
+++ b/docs/WeiSQL-项目状态报告.docx
@@ -23,7 +23,7 @@
           <w:color w:val="595959"/>
           <w:sz w:val="20"/>
         </w:rPr>
-        <w:t>2026-10-31 · 仓库 HEAD 54d5425 · 323 个自动化测试 · 尚未发布 npm</w:t>
+        <w:t>2026-10-31 · 仓库 HEAD ab98936 · 323 个自动化测试 · 尚未发布 npm</w:t>
       </w:r>
     </w:p>
     <w:p>
@@ -156,7 +156,7 @@
                 <w:rFonts w:ascii="微软雅黑" w:hAnsi="微软雅黑" w:eastAsia="微软雅黑" w:cs="微软雅黑"/>
                 <w:sz w:val="18"/>
               </w:rPr>
-              <w:t>GitHub Actions：Ubuntu + Windows 行为闸门，另有派生索引、容器与 bench:wasm 冒烟作业</w:t>
+              <w:t>GitHub Actions：Ubuntu + Windows 行为闸门（含 SQL 契约），另有派生索引、容器、bench:wasm 冒烟与 Chromium 探针作业</w:t>
             </w:r>
           </w:p>
         </w:tc>

</xml_diff>

<commit_message>
feat: update type inference rules for JSON objects and arrays in source-to-parquet documentation
</commit_message>
<xml_diff>
--- a/docs/WeiSQL-项目状态报告.docx
+++ b/docs/WeiSQL-项目状态报告.docx
@@ -23,7 +23,7 @@
           <w:color w:val="595959"/>
           <w:sz w:val="20"/>
         </w:rPr>
-        <w:t>2026-10-31 · 仓库 HEAD ab98936 · 323 个自动化测试 · 尚未发布 npm</w:t>
+        <w:t>2026-10-31 · 仓库 HEAD 908dda8 · 325 个自动化测试 · 尚未发布 npm</w:t>
       </w:r>
     </w:p>
     <w:p>
@@ -40,7 +40,7 @@
           <w:rFonts w:ascii="微软雅黑" w:hAnsi="微软雅黑" w:eastAsia="微软雅黑" w:cs="微软雅黑"/>
           <w:sz w:val="21"/>
         </w:rPr>
-        <w:t>工程原型。Manifest V1 与数据包格式稳定，五个包共 323 个自动化测试，CI 覆盖构建、类型、测试与发布元数据；精确检索、ANN、全文、融合、RAG、单文件容器与浏览器 SQL 均有实现与实测数字。尚未发布 npm 包，也没有任何未经测量的性能承诺。</w:t>
+        <w:t>工程原型。Manifest V1 与数据包格式稳定，五个包共 325 个自动化测试，CI 覆盖构建、类型、测试与发布元数据；精确检索、ANN、全文、融合、RAG、单文件容器与浏览器 SQL 均有实现与实测数字。尚未发布 npm 包，也没有任何未经测量的性能承诺。</w:t>
       </w:r>
     </w:p>
     <w:tbl>
@@ -124,7 +124,7 @@
                 <w:rFonts w:ascii="微软雅黑" w:hAnsi="微软雅黑" w:eastAsia="微软雅黑" w:cs="微软雅黑"/>
                 <w:sz w:val="18"/>
               </w:rPr>
-              <w:t>323 个全绿（SDK 209 / DuckDB 25 / WASM 38 / USearch 13 / CLI 38）</w:t>
+              <w:t>325 个全绿（SDK 209 / DuckDB 25 / WASM 38 / USearch 13 / CLI 40）</w:t>
             </w:r>
           </w:p>
         </w:tc>
@@ -2588,7 +2588,7 @@
                 <w:rFonts w:ascii="微软雅黑" w:hAnsi="微软雅黑" w:eastAsia="微软雅黑" w:cs="微软雅黑"/>
                 <w:sz w:val="18"/>
               </w:rPr>
-              <w:t>323</w:t>
+              <w:t>325</w:t>
             </w:r>
           </w:p>
         </w:tc>
@@ -5418,7 +5418,7 @@
                 <w:rFonts w:ascii="微软雅黑" w:hAnsi="微软雅黑" w:eastAsia="微软雅黑" w:cs="微软雅黑"/>
                 <w:sz w:val="18"/>
               </w:rPr>
-              <w:t>✓ 323 测试，typecheck 通过</w:t>
+              <w:t>✓ 325 测试，typecheck 通过</w:t>
             </w:r>
           </w:p>
         </w:tc>

</xml_diff>

<commit_message>
feat: restructure documentation and add architecture section
- Added a new architecture section with three main topics: overview, query chain, and trust & deployment.
- Updated the sidebar configuration to include the new architecture section and its related documents.
- Removed the old architecture document from the start section and linked to the new architecture overview.
- Updated links in the homepage and other documents to point to the new architecture section.
- Enhanced the content guide to clarify sidebar organization and document placement.
</commit_message>
<xml_diff>
--- a/docs/WeiSQL-项目状态报告.docx
+++ b/docs/WeiSQL-项目状态报告.docx
@@ -23,7 +23,7 @@
           <w:color w:val="595959"/>
           <w:sz w:val="20"/>
         </w:rPr>
-        <w:t>2026-10-31 · 仓库 HEAD 908dda8 · 326 个自动化测试 · 尚未发布 npm</w:t>
+        <w:t>2026-10-31 · 仓库 HEAD 3c7f223 · 329 个自动化测试 · 尚未发布 npm</w:t>
       </w:r>
     </w:p>
     <w:p>
@@ -40,7 +40,7 @@
           <w:rFonts w:ascii="微软雅黑" w:hAnsi="微软雅黑" w:eastAsia="微软雅黑" w:cs="微软雅黑"/>
           <w:sz w:val="21"/>
         </w:rPr>
-        <w:t>工程原型。Manifest V1 与数据包格式稳定，五个包共 326 个自动化测试，CI 覆盖构建、类型、测试与发布元数据；精确检索、ANN、全文、融合、RAG、单文件容器与浏览器 SQL 均有实现与实测数字。尚未发布 npm 包，也没有任何未经测量的性能承诺。</w:t>
+        <w:t>工程原型。Manifest V1 与数据包格式稳定，五个包共 329 个自动化测试，CI 覆盖构建、类型、测试与发布元数据；精确检索、ANN、全文、融合、RAG、单文件容器与浏览器 SQL 均有实现与实测数字。尚未发布 npm 包，也没有任何未经测量的性能承诺。</w:t>
       </w:r>
     </w:p>
     <w:tbl>
@@ -124,7 +124,7 @@
                 <w:rFonts w:ascii="微软雅黑" w:hAnsi="微软雅黑" w:eastAsia="微软雅黑" w:cs="微软雅黑"/>
                 <w:sz w:val="18"/>
               </w:rPr>
-              <w:t>326 个全绿（SDK 209 / DuckDB 25 / WASM 38 / USearch 13 / CLI 41）</w:t>
+              <w:t>329 个全绿（SDK 209 / DuckDB 25 / WASM 38 / USearch 13 / CLI 44）</w:t>
             </w:r>
           </w:p>
         </w:tc>
@@ -2588,7 +2588,7 @@
                 <w:rFonts w:ascii="微软雅黑" w:hAnsi="微软雅黑" w:eastAsia="微软雅黑" w:cs="微软雅黑"/>
                 <w:sz w:val="18"/>
               </w:rPr>
-              <w:t>326</w:t>
+              <w:t>329</w:t>
             </w:r>
           </w:p>
         </w:tc>
@@ -5418,7 +5418,7 @@
                 <w:rFonts w:ascii="微软雅黑" w:hAnsi="微软雅黑" w:eastAsia="微软雅黑" w:cs="微软雅黑"/>
                 <w:sz w:val="18"/>
               </w:rPr>
-              <w:t>✓ 326 测试，typecheck 通过</w:t>
+              <w:t>✓ 329 测试，typecheck 通过</w:t>
             </w:r>
           </w:p>
         </w:tc>

</xml_diff>

<commit_message>
feat: add examples for browser and Node.js usage, enhance documentation
- Added example sections for browser and Node.js in the documentation, showcasing how to use the SDK effectively.
- Introduced a new examples index page to organize and link to various code snippets.
- Updated existing API documentation to include example references for better clarity.
- Enhanced the styling and layout of example links for improved user experience.
- Added a custom 404 page for better navigation and user feedback when a page is not found.
- Incremented automated test counts in documentation to reflect recent additions.
</commit_message>
<xml_diff>
--- a/docs/WeiSQL-项目状态报告.docx
+++ b/docs/WeiSQL-项目状态报告.docx
@@ -23,7 +23,7 @@
           <w:color w:val="595959"/>
           <w:sz w:val="20"/>
         </w:rPr>
-        <w:t>2026-10-31 · 仓库 HEAD 3c7f223 · 329 个自动化测试 · 尚未发布 npm</w:t>
+        <w:t>2026-10-31 · 仓库 HEAD 7a9999f · 330 个自动化测试 · 尚未发布 npm</w:t>
       </w:r>
     </w:p>
     <w:p>
@@ -40,7 +40,7 @@
           <w:rFonts w:ascii="微软雅黑" w:hAnsi="微软雅黑" w:eastAsia="微软雅黑" w:cs="微软雅黑"/>
           <w:sz w:val="21"/>
         </w:rPr>
-        <w:t>工程原型。Manifest V1 与数据包格式稳定，五个包共 329 个自动化测试，CI 覆盖构建、类型、测试与发布元数据；精确检索、ANN、全文、融合、RAG、单文件容器与浏览器 SQL 均有实现与实测数字。尚未发布 npm 包，也没有任何未经测量的性能承诺。</w:t>
+        <w:t>工程原型。Manifest V1 与数据包格式稳定，五个包共 330 个自动化测试，CI 覆盖构建、类型、测试与发布元数据；精确检索、ANN、全文、融合、RAG、单文件容器与浏览器 SQL 均有实现与实测数字。尚未发布 npm 包，也没有任何未经测量的性能承诺。</w:t>
       </w:r>
     </w:p>
     <w:tbl>
@@ -124,7 +124,7 @@
                 <w:rFonts w:ascii="微软雅黑" w:hAnsi="微软雅黑" w:eastAsia="微软雅黑" w:cs="微软雅黑"/>
                 <w:sz w:val="18"/>
               </w:rPr>
-              <w:t>329 个全绿（SDK 209 / DuckDB 25 / WASM 38 / USearch 13 / CLI 44）</w:t>
+              <w:t>330 个全绿（SDK 209 / DuckDB 25 / WASM 39 / USearch 13 / CLI 44）</w:t>
             </w:r>
           </w:p>
         </w:tc>
@@ -1143,6 +1143,83 @@
                 <w:sz w:val="18"/>
               </w:rPr>
               <w:t>open() 1.37–1.70 s，查询 &lt; 50 ms</w:t>
+            </w:r>
+          </w:p>
+        </w:tc>
+      </w:tr>
+      <w:tr>
+        <w:tc>
+          <w:tcPr>
+            <w:tcW w:type="dxa" w:w="3628"/>
+          </w:tcPr>
+          <w:p>
+            <w:r/>
+            <w:r>
+              <w:rPr>
+                <w:rFonts w:ascii="微软雅黑" w:hAnsi="微软雅黑" w:eastAsia="微软雅黑" w:cs="微软雅黑"/>
+                <w:sz w:val="18"/>
+              </w:rPr>
+              <w:t>OPFS 持久化（opt-in）</w:t>
+            </w:r>
+          </w:p>
+        </w:tc>
+        <w:tc>
+          <w:tcPr>
+            <w:tcW w:type="dxa" w:w="964"/>
+          </w:tcPr>
+          <w:p>
+            <w:r/>
+            <w:r>
+              <w:rPr>
+                <w:rFonts w:ascii="微软雅黑" w:hAnsi="微软雅黑" w:eastAsia="微软雅黑" w:cs="微软雅黑"/>
+                <w:sz w:val="18"/>
+              </w:rPr>
+              <w:t>✓</w:t>
+            </w:r>
+          </w:p>
+        </w:tc>
+        <w:tc>
+          <w:tcPr>
+            <w:tcW w:type="dxa" w:w="964"/>
+          </w:tcPr>
+          <w:p>
+            <w:r/>
+            <w:r>
+              <w:rPr>
+                <w:rFonts w:ascii="微软雅黑" w:hAnsi="微软雅黑" w:eastAsia="微软雅黑" w:cs="微软雅黑"/>
+                <w:sz w:val="18"/>
+              </w:rPr>
+              <w:t>✓ + 探针</w:t>
+            </w:r>
+          </w:p>
+        </w:tc>
+        <w:tc>
+          <w:tcPr>
+            <w:tcW w:type="dxa" w:w="964"/>
+          </w:tcPr>
+          <w:p>
+            <w:r/>
+            <w:r>
+              <w:rPr>
+                <w:rFonts w:ascii="微软雅黑" w:hAnsi="微软雅黑" w:eastAsia="微软雅黑" w:cs="微软雅黑"/>
+                <w:sz w:val="18"/>
+              </w:rPr>
+              <w:t>✓</w:t>
+            </w:r>
+          </w:p>
+        </w:tc>
+        <w:tc>
+          <w:tcPr>
+            <w:tcW w:type="dxa" w:w="2438"/>
+          </w:tcPr>
+          <w:p>
+            <w:r/>
+            <w:r>
+              <w:rPr>
+                <w:rFonts w:ascii="微软雅黑" w:hAnsi="微软雅黑" w:eastAsia="微软雅黑" w:cs="微软雅黑"/>
+                <w:sz w:val="18"/>
+              </w:rPr>
+              <w:t>表摘要派生缓存键；第二次 open 命中 opfs-reused</w:t>
             </w:r>
           </w:p>
         </w:tc>
@@ -2588,7 +2665,7 @@
                 <w:rFonts w:ascii="微软雅黑" w:hAnsi="微软雅黑" w:eastAsia="微软雅黑" w:cs="微软雅黑"/>
                 <w:sz w:val="18"/>
               </w:rPr>
-              <w:t>329</w:t>
+              <w:t>330</w:t>
             </w:r>
           </w:p>
         </w:tc>
@@ -4759,7 +4836,7 @@
           <w:color w:val="595959"/>
           <w:sz w:val="20"/>
         </w:rPr>
-        <w:t>完整 70 条记录见仓库 docs/DECISION_LOG.md；下表列出与外部读者最相关的决策。</w:t>
+        <w:t>完整 73 条记录见仓库 docs/DECISION_LOG.md；下表列出与外部读者最相关的决策。</w:t>
       </w:r>
     </w:p>
     <w:tbl>
@@ -5418,7 +5495,7 @@
                 <w:rFonts w:ascii="微软雅黑" w:hAnsi="微软雅黑" w:eastAsia="微软雅黑" w:cs="微软雅黑"/>
                 <w:sz w:val="18"/>
               </w:rPr>
-              <w:t>✓ 329 测试，typecheck 通过</w:t>
+              <w:t>✓ 330 测试，typecheck 通过</w:t>
             </w:r>
           </w:p>
         </w:tc>

</xml_diff>

<commit_message>
feat: implement OPFS locking mechanism to prevent concurrent writes and enhance data integrity
</commit_message>
<xml_diff>
--- a/docs/WeiSQL-项目状态报告.docx
+++ b/docs/WeiSQL-项目状态报告.docx
@@ -23,7 +23,7 @@
           <w:color w:val="595959"/>
           <w:sz w:val="20"/>
         </w:rPr>
-        <w:t>2026-10-31 · 仓库 HEAD 225fdf4 · 331 个自动化测试 · 尚未发布 npm</w:t>
+        <w:t>2026-10-31 · 仓库 HEAD 0ab2868 · 332 个自动化测试 · 尚未发布 npm</w:t>
       </w:r>
     </w:p>
     <w:p>
@@ -40,7 +40,7 @@
           <w:rFonts w:ascii="微软雅黑" w:hAnsi="微软雅黑" w:eastAsia="微软雅黑" w:cs="微软雅黑"/>
           <w:sz w:val="21"/>
         </w:rPr>
-        <w:t>工程原型。Manifest V1 与数据包格式稳定，五个包共 331 个自动化测试，CI 覆盖构建、类型、测试与发布元数据；精确检索、ANN、全文、融合、RAG、单文件容器与浏览器 SQL 均有实现与实测数字。尚未发布 npm 包，也没有任何未经测量的性能承诺。</w:t>
+        <w:t>工程原型。Manifest V1 与数据包格式稳定，五个包共 332 个自动化测试，CI 覆盖构建、类型、测试与发布元数据；精确检索、ANN、全文、融合、RAG、单文件容器与浏览器 SQL 均有实现与实测数字。尚未发布 npm 包，也没有任何未经测量的性能承诺。</w:t>
       </w:r>
     </w:p>
     <w:tbl>
@@ -124,7 +124,7 @@
                 <w:rFonts w:ascii="微软雅黑" w:hAnsi="微软雅黑" w:eastAsia="微软雅黑" w:cs="微软雅黑"/>
                 <w:sz w:val="18"/>
               </w:rPr>
-              <w:t>331 个全绿（SDK 209 / DuckDB 25 / WASM 40 / USearch 13 / CLI 44）</w:t>
+              <w:t>332 个全绿（SDK 209 / DuckDB 25 / WASM 41 / USearch 13 / CLI 44）</w:t>
             </w:r>
           </w:p>
         </w:tc>
@@ -2665,7 +2665,7 @@
                 <w:rFonts w:ascii="微软雅黑" w:hAnsi="微软雅黑" w:eastAsia="微软雅黑" w:cs="微软雅黑"/>
                 <w:sz w:val="18"/>
               </w:rPr>
-              <w:t>331</w:t>
+              <w:t>332</w:t>
             </w:r>
           </w:p>
         </w:tc>
@@ -5495,7 +5495,7 @@
                 <w:rFonts w:ascii="微软雅黑" w:hAnsi="微软雅黑" w:eastAsia="微软雅黑" w:cs="微软雅黑"/>
                 <w:sz w:val="18"/>
               </w:rPr>
-              <w:t>✓ 331 测试，typecheck 通过</w:t>
+              <w:t>✓ 332 测试，typecheck 通过</w:t>
             </w:r>
           </w:p>
         </w:tc>

</xml_diff>

<commit_message>
feat: update documentation with memory benchmarks for browser materialization and DuckDB-Wasm performance
</commit_message>
<xml_diff>
--- a/docs/WeiSQL-项目状态报告.docx
+++ b/docs/WeiSQL-项目状态报告.docx
@@ -23,7 +23,7 @@
           <w:color w:val="595959"/>
           <w:sz w:val="20"/>
         </w:rPr>
-        <w:t>2026-10-31 · 仓库 HEAD 0ab2868 · 332 个自动化测试 · 尚未发布 npm</w:t>
+        <w:t>2026-10-31 · 仓库 HEAD 13cc2ad · 332 个自动化测试 · 尚未发布 npm</w:t>
       </w:r>
     </w:p>
     <w:p>
@@ -3685,6 +3685,68 @@
                 <w:sz w:val="18"/>
               </w:rPr>
               <w:t>open() 1,963/2,430 ms</w:t>
+            </w:r>
+          </w:p>
+        </w:tc>
+      </w:tr>
+      <w:tr>
+        <w:tc>
+          <w:tcPr>
+            <w:tcW w:type="dxa" w:w="2041"/>
+          </w:tcPr>
+          <w:p>
+            <w:r/>
+            <w:r>
+              <w:rPr>
+                <w:rFonts w:ascii="微软雅黑" w:hAnsi="微软雅黑" w:eastAsia="微软雅黑" w:cs="微软雅黑"/>
+                <w:sz w:val="18"/>
+              </w:rPr>
+              <w:t>浏览器物化内存</w:t>
+            </w:r>
+          </w:p>
+        </w:tc>
+        <w:tc>
+          <w:tcPr>
+            <w:tcW w:type="dxa" w:w="2154"/>
+          </w:tcPr>
+          <w:p>
+            <w:r/>
+            <w:r>
+              <w:rPr>
+                <w:rFonts w:ascii="微软雅黑" w:hAnsi="微软雅黑" w:eastAsia="微软雅黑" w:cs="微软雅黑"/>
+                <w:sz w:val="18"/>
+              </w:rPr>
+              <w:t>20 万/50 万/100 万行：堆 +10.7/+21.8/+40.7 MB；引擎 12.2/30.7/60.1 MB</w:t>
+            </w:r>
+          </w:p>
+        </w:tc>
+        <w:tc>
+          <w:tcPr>
+            <w:tcW w:type="dxa" w:w="3061"/>
+          </w:tcPr>
+          <w:p>
+            <w:r/>
+            <w:r>
+              <w:rPr>
+                <w:rFonts w:ascii="微软雅黑" w:hAnsi="微软雅黑" w:eastAsia="微软雅黑" w:cs="微软雅黑"/>
+                <w:sz w:val="18"/>
+              </w:rPr>
+              <w:t>真实 Parquet，Range + L3 + L4</w:t>
+            </w:r>
+          </w:p>
+        </w:tc>
+        <w:tc>
+          <w:tcPr>
+            <w:tcW w:type="dxa" w:w="1701"/>
+          </w:tcPr>
+          <w:p>
+            <w:r/>
+            <w:r>
+              <w:rPr>
+                <w:rFonts w:ascii="微软雅黑" w:hAnsi="微软雅黑" w:eastAsia="微软雅黑" w:cs="微软雅黑"/>
+                <w:sz w:val="18"/>
+              </w:rPr>
+              <w:t>约 60 MB/百万行；open() 2.1–2.8 s</w:t>
             </w:r>
           </w:p>
         </w:tc>

</xml_diff>

<commit_message>
feat: implement WASM vector adapter and enhance benchmarks, update documentation
</commit_message>
<xml_diff>
--- a/docs/WeiSQL-项目状态报告.docx
+++ b/docs/WeiSQL-项目状态报告.docx
@@ -23,7 +23,7 @@
           <w:color w:val="595959"/>
           <w:sz w:val="20"/>
         </w:rPr>
-        <w:t>2026-10-31 · 仓库 HEAD 13cc2ad · 332 个自动化测试 · 尚未发布 npm</w:t>
+        <w:t>2026-10-31 · 仓库 HEAD 4e5d359 · 333 个自动化测试 · 尚未发布 npm</w:t>
       </w:r>
     </w:p>
     <w:p>
@@ -40,7 +40,7 @@
           <w:rFonts w:ascii="微软雅黑" w:hAnsi="微软雅黑" w:eastAsia="微软雅黑" w:cs="微软雅黑"/>
           <w:sz w:val="21"/>
         </w:rPr>
-        <w:t>工程原型。Manifest V1 与数据包格式稳定，五个包共 332 个自动化测试，CI 覆盖构建、类型、测试与发布元数据；精确检索、ANN、全文、融合、RAG、单文件容器与浏览器 SQL 均有实现与实测数字。尚未发布 npm 包，也没有任何未经测量的性能承诺。</w:t>
+        <w:t>工程原型。Manifest V1 与数据包格式稳定，五个包共 333 个自动化测试，CI 覆盖构建、类型、测试与发布元数据；精确检索、ANN、全文、融合、RAG、单文件容器与浏览器 SQL 均有实现与实测数字。尚未发布 npm 包，也没有任何未经测量的性能承诺。</w:t>
       </w:r>
     </w:p>
     <w:tbl>
@@ -124,7 +124,7 @@
                 <w:rFonts w:ascii="微软雅黑" w:hAnsi="微软雅黑" w:eastAsia="微软雅黑" w:cs="微软雅黑"/>
                 <w:sz w:val="18"/>
               </w:rPr>
-              <w:t>332 个全绿（SDK 209 / DuckDB 25 / WASM 41 / USearch 13 / CLI 44）</w:t>
+              <w:t>333 个全绿（SDK 210 / DuckDB 25 / WASM 41 / USearch 13 / CLI 44）</w:t>
             </w:r>
           </w:p>
         </w:tc>
@@ -2665,7 +2665,7 @@
                 <w:rFonts w:ascii="微软雅黑" w:hAnsi="微软雅黑" w:eastAsia="微软雅黑" w:cs="微软雅黑"/>
                 <w:sz w:val="18"/>
               </w:rPr>
-              <w:t>332</w:t>
+              <w:t>333</w:t>
             </w:r>
           </w:p>
         </w:tc>
@@ -3716,7 +3716,7 @@
                 <w:rFonts w:ascii="微软雅黑" w:hAnsi="微软雅黑" w:eastAsia="微软雅黑" w:cs="微软雅黑"/>
                 <w:sz w:val="18"/>
               </w:rPr>
-              <w:t>20 万/50 万/100 万行：堆 +10.7/+21.8/+40.7 MB；引擎 12.2/30.7/60.1 MB</w:t>
+              <w:t>20 万/50 万/100 万/200 万行：引擎 12.2/30.7/60.1/119.4 MB</w:t>
             </w:r>
           </w:p>
         </w:tc>
@@ -3746,7 +3746,7 @@
                 <w:rFonts w:ascii="微软雅黑" w:hAnsi="微软雅黑" w:eastAsia="微软雅黑" w:cs="微软雅黑"/>
                 <w:sz w:val="18"/>
               </w:rPr>
-              <w:t>约 60 MB/百万行；open() 2.1–2.8 s</w:t>
+              <w:t>约 60 MB/百万行；open() 2.0–4.4 s</w:t>
             </w:r>
           </w:p>
         </w:tc>
@@ -5557,7 +5557,7 @@
                 <w:rFonts w:ascii="微软雅黑" w:hAnsi="微软雅黑" w:eastAsia="微软雅黑" w:cs="微软雅黑"/>
                 <w:sz w:val="18"/>
               </w:rPr>
-              <w:t>✓ 332 测试，typecheck 通过</w:t>
+              <w:t>✓ 333 测试，typecheck 通过</w:t>
             </w:r>
           </w:p>
         </w:tc>

</xml_diff>